<commit_message>
adding the documentation to the repo
</commit_message>
<xml_diff>
--- a/Documentation_CICD_Assignment.docx
+++ b/Documentation_CICD_Assignment.docx
@@ -4,6 +4,14 @@
   <w:body>
     <w:sdt>
       <w:sdtPr>
+        <w:rPr>
+          <w:rFonts w:asciiTheme="minorHAnsi" w:eastAsiaTheme="minorHAnsi" w:hAnsiTheme="minorHAnsi" w:cstheme="minorBidi"/>
+          <w:color w:val="auto"/>
+          <w:kern w:val="2"/>
+          <w:sz w:val="24"/>
+          <w:szCs w:val="24"/>
+          <w14:ligatures w14:val="standardContextual"/>
+        </w:rPr>
         <w:id w:val="-666236885"/>
         <w:docPartObj>
           <w:docPartGallery w:val="Table of Contents"/>
@@ -12,15 +20,9 @@
       </w:sdtPr>
       <w:sdtEndPr>
         <w:rPr>
-          <w:rFonts w:asciiTheme="minorHAnsi" w:eastAsiaTheme="minorHAnsi" w:hAnsiTheme="minorHAnsi" w:cstheme="minorBidi"/>
           <w:b/>
           <w:bCs/>
           <w:noProof/>
-          <w:color w:val="auto"/>
-          <w:kern w:val="2"/>
-          <w:sz w:val="24"/>
-          <w:szCs w:val="24"/>
-          <w14:ligatures w14:val="standardContextual"/>
         </w:rPr>
       </w:sdtEndPr>
       <w:sdtContent>
@@ -52,12 +54,81 @@
           <w:r>
             <w:fldChar w:fldCharType="separate"/>
           </w:r>
-          <w:hyperlink w:anchor="_Toc233917665" w:history="1">
+          <w:hyperlink w:anchor="_Toc233919937" w:history="1">
             <w:r>
               <w:rPr>
                 <w:rStyle w:val="Hyperlink"/>
                 <w:noProof/>
               </w:rPr>
+              <w:t>GitHub Repo: https://github.com/ApoorvaD90/Devops_CI_CD_Pipeline</w:t>
+            </w:r>
+            <w:r>
+              <w:rPr>
+                <w:noProof/>
+                <w:webHidden/>
+              </w:rPr>
+              <w:tab/>
+            </w:r>
+            <w:r>
+              <w:rPr>
+                <w:noProof/>
+                <w:webHidden/>
+              </w:rPr>
+              <w:fldChar w:fldCharType="begin"/>
+            </w:r>
+            <w:r>
+              <w:rPr>
+                <w:noProof/>
+                <w:webHidden/>
+              </w:rPr>
+              <w:instrText xml:space="preserve"> PAGEREF _Toc233919937 \h </w:instrText>
+            </w:r>
+            <w:r>
+              <w:rPr>
+                <w:noProof/>
+                <w:webHidden/>
+              </w:rPr>
+            </w:r>
+            <w:r>
+              <w:rPr>
+                <w:noProof/>
+                <w:webHidden/>
+              </w:rPr>
+              <w:fldChar w:fldCharType="separate"/>
+            </w:r>
+            <w:r>
+              <w:rPr>
+                <w:noProof/>
+                <w:webHidden/>
+              </w:rPr>
+              <w:t>3</w:t>
+            </w:r>
+            <w:r>
+              <w:rPr>
+                <w:noProof/>
+                <w:webHidden/>
+              </w:rPr>
+              <w:fldChar w:fldCharType="end"/>
+            </w:r>
+          </w:hyperlink>
+        </w:p>
+        <w:p>
+          <w:pPr>
+            <w:pStyle w:val="TOC1"/>
+            <w:tabs>
+              <w:tab w:val="right" w:leader="dot" w:pos="9350"/>
+            </w:tabs>
+            <w:rPr>
+              <w:rFonts w:eastAsiaTheme="minorEastAsia"/>
+              <w:noProof/>
+            </w:rPr>
+          </w:pPr>
+          <w:hyperlink w:anchor="_Toc233919938" w:history="1">
+            <w:r>
+              <w:rPr>
+                <w:rStyle w:val="Hyperlink"/>
+                <w:noProof/>
+              </w:rPr>
               <w:t>1. Jenkins CI CD pipeline for flask application</w:t>
             </w:r>
             <w:r>
@@ -79,7 +150,7 @@
                 <w:noProof/>
                 <w:webHidden/>
               </w:rPr>
-              <w:instrText xml:space="preserve"> PAGEREF _Toc233917665 \h </w:instrText>
+              <w:instrText xml:space="preserve"> PAGEREF _Toc233919938 \h </w:instrText>
             </w:r>
             <w:r>
               <w:rPr>
@@ -121,7 +192,7 @@
               <w:noProof/>
             </w:rPr>
           </w:pPr>
-          <w:hyperlink w:anchor="_Toc233917666" w:history="1">
+          <w:hyperlink w:anchor="_Toc233919939" w:history="1">
             <w:r>
               <w:rPr>
                 <w:rStyle w:val="Hyperlink"/>
@@ -148,7 +219,7 @@
                 <w:noProof/>
                 <w:webHidden/>
               </w:rPr>
-              <w:instrText xml:space="preserve"> PAGEREF _Toc233917666 \h </w:instrText>
+              <w:instrText xml:space="preserve"> PAGEREF _Toc233919939 \h </w:instrText>
             </w:r>
             <w:r>
               <w:rPr>
@@ -190,7 +261,7 @@
               <w:noProof/>
             </w:rPr>
           </w:pPr>
-          <w:hyperlink w:anchor="_Toc233917667" w:history="1">
+          <w:hyperlink w:anchor="_Toc233919940" w:history="1">
             <w:r>
               <w:rPr>
                 <w:rStyle w:val="Hyperlink"/>
@@ -217,7 +288,7 @@
                 <w:noProof/>
                 <w:webHidden/>
               </w:rPr>
-              <w:instrText xml:space="preserve"> PAGEREF _Toc233917667 \h </w:instrText>
+              <w:instrText xml:space="preserve"> PAGEREF _Toc233919940 \h </w:instrText>
             </w:r>
             <w:r>
               <w:rPr>
@@ -259,7 +330,7 @@
               <w:noProof/>
             </w:rPr>
           </w:pPr>
-          <w:hyperlink w:anchor="_Toc233917668" w:history="1">
+          <w:hyperlink w:anchor="_Toc233919941" w:history="1">
             <w:r>
               <w:rPr>
                 <w:rStyle w:val="Hyperlink"/>
@@ -286,7 +357,7 @@
                 <w:noProof/>
                 <w:webHidden/>
               </w:rPr>
-              <w:instrText xml:space="preserve"> PAGEREF _Toc233917668 \h </w:instrText>
+              <w:instrText xml:space="preserve"> PAGEREF _Toc233919941 \h </w:instrText>
             </w:r>
             <w:r>
               <w:rPr>
@@ -328,7 +399,7 @@
               <w:noProof/>
             </w:rPr>
           </w:pPr>
-          <w:hyperlink w:anchor="_Toc233917669" w:history="1">
+          <w:hyperlink w:anchor="_Toc233919942" w:history="1">
             <w:r>
               <w:rPr>
                 <w:rStyle w:val="Hyperlink"/>
@@ -355,7 +426,7 @@
                 <w:noProof/>
                 <w:webHidden/>
               </w:rPr>
-              <w:instrText xml:space="preserve"> PAGEREF _Toc233917669 \h </w:instrText>
+              <w:instrText xml:space="preserve"> PAGEREF _Toc233919942 \h </w:instrText>
             </w:r>
             <w:r>
               <w:rPr>
@@ -397,7 +468,7 @@
               <w:noProof/>
             </w:rPr>
           </w:pPr>
-          <w:hyperlink w:anchor="_Toc233917670" w:history="1">
+          <w:hyperlink w:anchor="_Toc233919943" w:history="1">
             <w:r>
               <w:rPr>
                 <w:rStyle w:val="Hyperlink"/>
@@ -424,7 +495,7 @@
                 <w:noProof/>
                 <w:webHidden/>
               </w:rPr>
-              <w:instrText xml:space="preserve"> PAGEREF _Toc233917670 \h </w:instrText>
+              <w:instrText xml:space="preserve"> PAGEREF _Toc233919943 \h </w:instrText>
             </w:r>
             <w:r>
               <w:rPr>
@@ -466,7 +537,7 @@
               <w:noProof/>
             </w:rPr>
           </w:pPr>
-          <w:hyperlink w:anchor="_Toc233917671" w:history="1">
+          <w:hyperlink w:anchor="_Toc233919944" w:history="1">
             <w:r>
               <w:rPr>
                 <w:rStyle w:val="Hyperlink"/>
@@ -493,7 +564,7 @@
                 <w:noProof/>
                 <w:webHidden/>
               </w:rPr>
-              <w:instrText xml:space="preserve"> PAGEREF _Toc233917671 \h </w:instrText>
+              <w:instrText xml:space="preserve"> PAGEREF _Toc233919944 \h </w:instrText>
             </w:r>
             <w:r>
               <w:rPr>
@@ -535,7 +606,7 @@
               <w:noProof/>
             </w:rPr>
           </w:pPr>
-          <w:hyperlink w:anchor="_Toc233917672" w:history="1">
+          <w:hyperlink w:anchor="_Toc233919945" w:history="1">
             <w:r>
               <w:rPr>
                 <w:rStyle w:val="Hyperlink"/>
@@ -562,7 +633,7 @@
                 <w:noProof/>
                 <w:webHidden/>
               </w:rPr>
-              <w:instrText xml:space="preserve"> PAGEREF _Toc233917672 \h </w:instrText>
+              <w:instrText xml:space="preserve"> PAGEREF _Toc233919945 \h </w:instrText>
             </w:r>
             <w:r>
               <w:rPr>
@@ -604,7 +675,7 @@
               <w:noProof/>
             </w:rPr>
           </w:pPr>
-          <w:hyperlink w:anchor="_Toc233917673" w:history="1">
+          <w:hyperlink w:anchor="_Toc233919946" w:history="1">
             <w:r>
               <w:rPr>
                 <w:rStyle w:val="Hyperlink"/>
@@ -631,7 +702,7 @@
                 <w:noProof/>
                 <w:webHidden/>
               </w:rPr>
-              <w:instrText xml:space="preserve"> PAGEREF _Toc233917673 \h </w:instrText>
+              <w:instrText xml:space="preserve"> PAGEREF _Toc233919946 \h </w:instrText>
             </w:r>
             <w:r>
               <w:rPr>
@@ -673,7 +744,7 @@
               <w:noProof/>
             </w:rPr>
           </w:pPr>
-          <w:hyperlink w:anchor="_Toc233917674" w:history="1">
+          <w:hyperlink w:anchor="_Toc233919947" w:history="1">
             <w:r>
               <w:rPr>
                 <w:rStyle w:val="Hyperlink"/>
@@ -700,7 +771,7 @@
                 <w:noProof/>
                 <w:webHidden/>
               </w:rPr>
-              <w:instrText xml:space="preserve"> PAGEREF _Toc233917674 \h </w:instrText>
+              <w:instrText xml:space="preserve"> PAGEREF _Toc233919947 \h </w:instrText>
             </w:r>
             <w:r>
               <w:rPr>
@@ -742,7 +813,7 @@
               <w:noProof/>
             </w:rPr>
           </w:pPr>
-          <w:hyperlink w:anchor="_Toc233917675" w:history="1">
+          <w:hyperlink w:anchor="_Toc233919948" w:history="1">
             <w:r>
               <w:rPr>
                 <w:rStyle w:val="Hyperlink"/>
@@ -769,7 +840,7 @@
                 <w:noProof/>
                 <w:webHidden/>
               </w:rPr>
-              <w:instrText xml:space="preserve"> PAGEREF _Toc233917675 \h </w:instrText>
+              <w:instrText xml:space="preserve"> PAGEREF _Toc233919948 \h </w:instrText>
             </w:r>
             <w:r>
               <w:rPr>
@@ -811,7 +882,7 @@
               <w:noProof/>
             </w:rPr>
           </w:pPr>
-          <w:hyperlink w:anchor="_Toc233917676" w:history="1">
+          <w:hyperlink w:anchor="_Toc233919949" w:history="1">
             <w:r>
               <w:rPr>
                 <w:rStyle w:val="Hyperlink"/>
@@ -838,7 +909,7 @@
                 <w:noProof/>
                 <w:webHidden/>
               </w:rPr>
-              <w:instrText xml:space="preserve"> PAGEREF _Toc233917676 \h </w:instrText>
+              <w:instrText xml:space="preserve"> PAGEREF _Toc233919949 \h </w:instrText>
             </w:r>
             <w:r>
               <w:rPr>
@@ -880,7 +951,7 @@
               <w:noProof/>
             </w:rPr>
           </w:pPr>
-          <w:hyperlink w:anchor="_Toc233917677" w:history="1">
+          <w:hyperlink w:anchor="_Toc233919950" w:history="1">
             <w:r>
               <w:rPr>
                 <w:rStyle w:val="Hyperlink"/>
@@ -907,7 +978,7 @@
                 <w:noProof/>
                 <w:webHidden/>
               </w:rPr>
-              <w:instrText xml:space="preserve"> PAGEREF _Toc233917677 \h </w:instrText>
+              <w:instrText xml:space="preserve"> PAGEREF _Toc233919950 \h </w:instrText>
             </w:r>
             <w:r>
               <w:rPr>
@@ -928,6 +999,420 @@
                 <w:webHidden/>
               </w:rPr>
               <w:t>14</w:t>
+            </w:r>
+            <w:r>
+              <w:rPr>
+                <w:noProof/>
+                <w:webHidden/>
+              </w:rPr>
+              <w:fldChar w:fldCharType="end"/>
+            </w:r>
+          </w:hyperlink>
+        </w:p>
+        <w:p>
+          <w:pPr>
+            <w:pStyle w:val="TOC2"/>
+            <w:tabs>
+              <w:tab w:val="right" w:leader="dot" w:pos="9350"/>
+            </w:tabs>
+            <w:rPr>
+              <w:rFonts w:eastAsiaTheme="minorEastAsia"/>
+              <w:noProof/>
+            </w:rPr>
+          </w:pPr>
+          <w:hyperlink w:anchor="_Toc233919951" w:history="1">
+            <w:r>
+              <w:rPr>
+                <w:rStyle w:val="Hyperlink"/>
+                <w:noProof/>
+              </w:rPr>
+              <w:t>4. Triggers:</w:t>
+            </w:r>
+            <w:r>
+              <w:rPr>
+                <w:noProof/>
+                <w:webHidden/>
+              </w:rPr>
+              <w:tab/>
+            </w:r>
+            <w:r>
+              <w:rPr>
+                <w:noProof/>
+                <w:webHidden/>
+              </w:rPr>
+              <w:fldChar w:fldCharType="begin"/>
+            </w:r>
+            <w:r>
+              <w:rPr>
+                <w:noProof/>
+                <w:webHidden/>
+              </w:rPr>
+              <w:instrText xml:space="preserve"> PAGEREF _Toc233919951 \h </w:instrText>
+            </w:r>
+            <w:r>
+              <w:rPr>
+                <w:noProof/>
+                <w:webHidden/>
+              </w:rPr>
+            </w:r>
+            <w:r>
+              <w:rPr>
+                <w:noProof/>
+                <w:webHidden/>
+              </w:rPr>
+              <w:fldChar w:fldCharType="separate"/>
+            </w:r>
+            <w:r>
+              <w:rPr>
+                <w:noProof/>
+                <w:webHidden/>
+              </w:rPr>
+              <w:t>36</w:t>
+            </w:r>
+            <w:r>
+              <w:rPr>
+                <w:noProof/>
+                <w:webHidden/>
+              </w:rPr>
+              <w:fldChar w:fldCharType="end"/>
+            </w:r>
+          </w:hyperlink>
+        </w:p>
+        <w:p>
+          <w:pPr>
+            <w:pStyle w:val="TOC3"/>
+            <w:tabs>
+              <w:tab w:val="right" w:leader="dot" w:pos="9350"/>
+            </w:tabs>
+            <w:rPr>
+              <w:rFonts w:eastAsiaTheme="minorEastAsia"/>
+              <w:noProof/>
+            </w:rPr>
+          </w:pPr>
+          <w:hyperlink w:anchor="_Toc233919952" w:history="1">
+            <w:r>
+              <w:rPr>
+                <w:rStyle w:val="Hyperlink"/>
+                <w:noProof/>
+              </w:rPr>
+              <w:t>- Configure the pipeline to trigger a new build whenever changes are pushed to the main branch of the repository.</w:t>
+            </w:r>
+            <w:r>
+              <w:rPr>
+                <w:noProof/>
+                <w:webHidden/>
+              </w:rPr>
+              <w:tab/>
+            </w:r>
+            <w:r>
+              <w:rPr>
+                <w:noProof/>
+                <w:webHidden/>
+              </w:rPr>
+              <w:fldChar w:fldCharType="begin"/>
+            </w:r>
+            <w:r>
+              <w:rPr>
+                <w:noProof/>
+                <w:webHidden/>
+              </w:rPr>
+              <w:instrText xml:space="preserve"> PAGEREF _Toc233919952 \h </w:instrText>
+            </w:r>
+            <w:r>
+              <w:rPr>
+                <w:noProof/>
+                <w:webHidden/>
+              </w:rPr>
+            </w:r>
+            <w:r>
+              <w:rPr>
+                <w:noProof/>
+                <w:webHidden/>
+              </w:rPr>
+              <w:fldChar w:fldCharType="separate"/>
+            </w:r>
+            <w:r>
+              <w:rPr>
+                <w:noProof/>
+                <w:webHidden/>
+              </w:rPr>
+              <w:t>36</w:t>
+            </w:r>
+            <w:r>
+              <w:rPr>
+                <w:noProof/>
+                <w:webHidden/>
+              </w:rPr>
+              <w:fldChar w:fldCharType="end"/>
+            </w:r>
+          </w:hyperlink>
+        </w:p>
+        <w:p>
+          <w:pPr>
+            <w:pStyle w:val="TOC2"/>
+            <w:tabs>
+              <w:tab w:val="right" w:leader="dot" w:pos="9350"/>
+            </w:tabs>
+            <w:rPr>
+              <w:rFonts w:eastAsiaTheme="minorEastAsia"/>
+              <w:noProof/>
+            </w:rPr>
+          </w:pPr>
+          <w:hyperlink w:anchor="_Toc233919953" w:history="1">
+            <w:r>
+              <w:rPr>
+                <w:rStyle w:val="Hyperlink"/>
+                <w:noProof/>
+              </w:rPr>
+              <w:t>5. Notifications:</w:t>
+            </w:r>
+            <w:r>
+              <w:rPr>
+                <w:noProof/>
+                <w:webHidden/>
+              </w:rPr>
+              <w:tab/>
+            </w:r>
+            <w:r>
+              <w:rPr>
+                <w:noProof/>
+                <w:webHidden/>
+              </w:rPr>
+              <w:fldChar w:fldCharType="begin"/>
+            </w:r>
+            <w:r>
+              <w:rPr>
+                <w:noProof/>
+                <w:webHidden/>
+              </w:rPr>
+              <w:instrText xml:space="preserve"> PAGEREF _Toc233919953 \h </w:instrText>
+            </w:r>
+            <w:r>
+              <w:rPr>
+                <w:noProof/>
+                <w:webHidden/>
+              </w:rPr>
+            </w:r>
+            <w:r>
+              <w:rPr>
+                <w:noProof/>
+                <w:webHidden/>
+              </w:rPr>
+              <w:fldChar w:fldCharType="separate"/>
+            </w:r>
+            <w:r>
+              <w:rPr>
+                <w:noProof/>
+                <w:webHidden/>
+              </w:rPr>
+              <w:t>36</w:t>
+            </w:r>
+            <w:r>
+              <w:rPr>
+                <w:noProof/>
+                <w:webHidden/>
+              </w:rPr>
+              <w:fldChar w:fldCharType="end"/>
+            </w:r>
+          </w:hyperlink>
+        </w:p>
+        <w:p>
+          <w:pPr>
+            <w:pStyle w:val="TOC3"/>
+            <w:tabs>
+              <w:tab w:val="right" w:leader="dot" w:pos="9350"/>
+            </w:tabs>
+            <w:rPr>
+              <w:rFonts w:eastAsiaTheme="minorEastAsia"/>
+              <w:noProof/>
+            </w:rPr>
+          </w:pPr>
+          <w:hyperlink w:anchor="_Toc233919954" w:history="1">
+            <w:r>
+              <w:rPr>
+                <w:rStyle w:val="Hyperlink"/>
+                <w:noProof/>
+              </w:rPr>
+              <w:t>- Set up a notification system to alert via email when the build process fails or succeeds.</w:t>
+            </w:r>
+            <w:r>
+              <w:rPr>
+                <w:noProof/>
+                <w:webHidden/>
+              </w:rPr>
+              <w:tab/>
+            </w:r>
+            <w:r>
+              <w:rPr>
+                <w:noProof/>
+                <w:webHidden/>
+              </w:rPr>
+              <w:fldChar w:fldCharType="begin"/>
+            </w:r>
+            <w:r>
+              <w:rPr>
+                <w:noProof/>
+                <w:webHidden/>
+              </w:rPr>
+              <w:instrText xml:space="preserve"> PAGEREF _Toc233919954 \h </w:instrText>
+            </w:r>
+            <w:r>
+              <w:rPr>
+                <w:noProof/>
+                <w:webHidden/>
+              </w:rPr>
+            </w:r>
+            <w:r>
+              <w:rPr>
+                <w:noProof/>
+                <w:webHidden/>
+              </w:rPr>
+              <w:fldChar w:fldCharType="separate"/>
+            </w:r>
+            <w:r>
+              <w:rPr>
+                <w:noProof/>
+                <w:webHidden/>
+              </w:rPr>
+              <w:t>36</w:t>
+            </w:r>
+            <w:r>
+              <w:rPr>
+                <w:noProof/>
+                <w:webHidden/>
+              </w:rPr>
+              <w:fldChar w:fldCharType="end"/>
+            </w:r>
+          </w:hyperlink>
+        </w:p>
+        <w:p>
+          <w:pPr>
+            <w:pStyle w:val="TOC2"/>
+            <w:tabs>
+              <w:tab w:val="right" w:leader="dot" w:pos="9350"/>
+            </w:tabs>
+            <w:rPr>
+              <w:rFonts w:eastAsiaTheme="minorEastAsia"/>
+              <w:noProof/>
+            </w:rPr>
+          </w:pPr>
+          <w:hyperlink w:anchor="_Toc233919955" w:history="1">
+            <w:r>
+              <w:rPr>
+                <w:rStyle w:val="Hyperlink"/>
+                <w:noProof/>
+              </w:rPr>
+              <w:t>6. Documentation:</w:t>
+            </w:r>
+            <w:r>
+              <w:rPr>
+                <w:noProof/>
+                <w:webHidden/>
+              </w:rPr>
+              <w:tab/>
+            </w:r>
+            <w:r>
+              <w:rPr>
+                <w:noProof/>
+                <w:webHidden/>
+              </w:rPr>
+              <w:fldChar w:fldCharType="begin"/>
+            </w:r>
+            <w:r>
+              <w:rPr>
+                <w:noProof/>
+                <w:webHidden/>
+              </w:rPr>
+              <w:instrText xml:space="preserve"> PAGEREF _Toc233919955 \h </w:instrText>
+            </w:r>
+            <w:r>
+              <w:rPr>
+                <w:noProof/>
+                <w:webHidden/>
+              </w:rPr>
+            </w:r>
+            <w:r>
+              <w:rPr>
+                <w:noProof/>
+                <w:webHidden/>
+              </w:rPr>
+              <w:fldChar w:fldCharType="separate"/>
+            </w:r>
+            <w:r>
+              <w:rPr>
+                <w:noProof/>
+                <w:webHidden/>
+              </w:rPr>
+              <w:t>37</w:t>
+            </w:r>
+            <w:r>
+              <w:rPr>
+                <w:noProof/>
+                <w:webHidden/>
+              </w:rPr>
+              <w:fldChar w:fldCharType="end"/>
+            </w:r>
+          </w:hyperlink>
+        </w:p>
+        <w:p>
+          <w:pPr>
+            <w:pStyle w:val="TOC3"/>
+            <w:tabs>
+              <w:tab w:val="right" w:leader="dot" w:pos="9350"/>
+            </w:tabs>
+            <w:rPr>
+              <w:rFonts w:eastAsiaTheme="minorEastAsia"/>
+              <w:noProof/>
+            </w:rPr>
+          </w:pPr>
+          <w:hyperlink w:anchor="_Toc233919956" w:history="1">
+            <w:r>
+              <w:rPr>
+                <w:rStyle w:val="Hyperlink"/>
+                <w:noProof/>
+              </w:rPr>
+              <w:t>- Document the pipeline process and any prerequisites needed for the setup in a README.md file in the repository.</w:t>
+            </w:r>
+            <w:r>
+              <w:rPr>
+                <w:noProof/>
+                <w:webHidden/>
+              </w:rPr>
+              <w:tab/>
+            </w:r>
+            <w:r>
+              <w:rPr>
+                <w:noProof/>
+                <w:webHidden/>
+              </w:rPr>
+              <w:fldChar w:fldCharType="begin"/>
+            </w:r>
+            <w:r>
+              <w:rPr>
+                <w:noProof/>
+                <w:webHidden/>
+              </w:rPr>
+              <w:instrText xml:space="preserve"> PAGEREF _Toc233919956 \h </w:instrText>
+            </w:r>
+            <w:r>
+              <w:rPr>
+                <w:noProof/>
+                <w:webHidden/>
+              </w:rPr>
+            </w:r>
+            <w:r>
+              <w:rPr>
+                <w:noProof/>
+                <w:webHidden/>
+              </w:rPr>
+              <w:fldChar w:fldCharType="separate"/>
+            </w:r>
+            <w:r>
+              <w:rPr>
+                <w:noProof/>
+                <w:webHidden/>
+              </w:rPr>
+              <w:t>37</w:t>
             </w:r>
             <w:r>
               <w:rPr>
@@ -949,7 +1434,7 @@
               <w:noProof/>
             </w:rPr>
           </w:pPr>
-          <w:hyperlink w:anchor="_Toc233917678" w:history="1">
+          <w:hyperlink w:anchor="_Toc233919957" w:history="1">
             <w:r>
               <w:rPr>
                 <w:rStyle w:val="Hyperlink"/>
@@ -976,7 +1461,7 @@
                 <w:noProof/>
                 <w:webHidden/>
               </w:rPr>
-              <w:instrText xml:space="preserve"> PAGEREF _Toc233917678 \h </w:instrText>
+              <w:instrText xml:space="preserve"> PAGEREF _Toc233919957 \h </w:instrText>
             </w:r>
             <w:r>
               <w:rPr>
@@ -996,7 +1481,7 @@
                 <w:noProof/>
                 <w:webHidden/>
               </w:rPr>
-              <w:t>36</w:t>
+              <w:t>38</w:t>
             </w:r>
             <w:r>
               <w:rPr>
@@ -1018,7 +1503,7 @@
               <w:noProof/>
             </w:rPr>
           </w:pPr>
-          <w:hyperlink w:anchor="_Toc233917679" w:history="1">
+          <w:hyperlink w:anchor="_Toc233919958" w:history="1">
             <w:r>
               <w:rPr>
                 <w:rStyle w:val="Hyperlink"/>
@@ -1045,7 +1530,7 @@
                 <w:noProof/>
                 <w:webHidden/>
               </w:rPr>
-              <w:instrText xml:space="preserve"> PAGEREF _Toc233917679 \h </w:instrText>
+              <w:instrText xml:space="preserve"> PAGEREF _Toc233919958 \h </w:instrText>
             </w:r>
             <w:r>
               <w:rPr>
@@ -1065,7 +1550,7 @@
                 <w:noProof/>
                 <w:webHidden/>
               </w:rPr>
-              <w:t>36</w:t>
+              <w:t>38</w:t>
             </w:r>
             <w:r>
               <w:rPr>
@@ -1087,7 +1572,7 @@
               <w:noProof/>
             </w:rPr>
           </w:pPr>
-          <w:hyperlink w:anchor="_Toc233917680" w:history="1">
+          <w:hyperlink w:anchor="_Toc233919959" w:history="1">
             <w:r>
               <w:rPr>
                 <w:rStyle w:val="Hyperlink"/>
@@ -1114,7 +1599,7 @@
                 <w:noProof/>
                 <w:webHidden/>
               </w:rPr>
-              <w:instrText xml:space="preserve"> PAGEREF _Toc233917680 \h </w:instrText>
+              <w:instrText xml:space="preserve"> PAGEREF _Toc233919959 \h </w:instrText>
             </w:r>
             <w:r>
               <w:rPr>
@@ -1134,7 +1619,7 @@
                 <w:noProof/>
                 <w:webHidden/>
               </w:rPr>
-              <w:t>36</w:t>
+              <w:t>38</w:t>
             </w:r>
             <w:r>
               <w:rPr>
@@ -1156,7 +1641,7 @@
               <w:noProof/>
             </w:rPr>
           </w:pPr>
-          <w:hyperlink w:anchor="_Toc233917681" w:history="1">
+          <w:hyperlink w:anchor="_Toc233919960" w:history="1">
             <w:r>
               <w:rPr>
                 <w:rStyle w:val="Hyperlink"/>
@@ -1183,7 +1668,7 @@
                 <w:noProof/>
                 <w:webHidden/>
               </w:rPr>
-              <w:instrText xml:space="preserve"> PAGEREF _Toc233917681 \h </w:instrText>
+              <w:instrText xml:space="preserve"> PAGEREF _Toc233919960 \h </w:instrText>
             </w:r>
             <w:r>
               <w:rPr>
@@ -1203,7 +1688,7 @@
                 <w:noProof/>
                 <w:webHidden/>
               </w:rPr>
-              <w:t>36</w:t>
+              <w:t>38</w:t>
             </w:r>
             <w:r>
               <w:rPr>
@@ -1225,7 +1710,7 @@
               <w:noProof/>
             </w:rPr>
           </w:pPr>
-          <w:hyperlink w:anchor="_Toc233917682" w:history="1">
+          <w:hyperlink w:anchor="_Toc233919961" w:history="1">
             <w:r>
               <w:rPr>
                 <w:rStyle w:val="Hyperlink"/>
@@ -1252,7 +1737,7 @@
                 <w:noProof/>
                 <w:webHidden/>
               </w:rPr>
-              <w:instrText xml:space="preserve"> PAGEREF _Toc233917682 \h </w:instrText>
+              <w:instrText xml:space="preserve"> PAGEREF _Toc233919961 \h </w:instrText>
             </w:r>
             <w:r>
               <w:rPr>
@@ -1272,7 +1757,7 @@
                 <w:noProof/>
                 <w:webHidden/>
               </w:rPr>
-              <w:t>37</w:t>
+              <w:t>39</w:t>
             </w:r>
             <w:r>
               <w:rPr>
@@ -1294,7 +1779,7 @@
               <w:noProof/>
             </w:rPr>
           </w:pPr>
-          <w:hyperlink w:anchor="_Toc233917683" w:history="1">
+          <w:hyperlink w:anchor="_Toc233919962" w:history="1">
             <w:r>
               <w:rPr>
                 <w:rStyle w:val="Hyperlink"/>
@@ -1321,7 +1806,7 @@
                 <w:noProof/>
                 <w:webHidden/>
               </w:rPr>
-              <w:instrText xml:space="preserve"> PAGEREF _Toc233917683 \h </w:instrText>
+              <w:instrText xml:space="preserve"> PAGEREF _Toc233919962 \h </w:instrText>
             </w:r>
             <w:r>
               <w:rPr>
@@ -1341,7 +1826,7 @@
                 <w:noProof/>
                 <w:webHidden/>
               </w:rPr>
-              <w:t>37</w:t>
+              <w:t>39</w:t>
             </w:r>
             <w:r>
               <w:rPr>
@@ -1363,7 +1848,7 @@
               <w:noProof/>
             </w:rPr>
           </w:pPr>
-          <w:hyperlink w:anchor="_Toc233917684" w:history="1">
+          <w:hyperlink w:anchor="_Toc233919963" w:history="1">
             <w:r>
               <w:rPr>
                 <w:rStyle w:val="Hyperlink"/>
@@ -1390,7 +1875,7 @@
                 <w:noProof/>
                 <w:webHidden/>
               </w:rPr>
-              <w:instrText xml:space="preserve"> PAGEREF _Toc233917684 \h </w:instrText>
+              <w:instrText xml:space="preserve"> PAGEREF _Toc233919963 \h </w:instrText>
             </w:r>
             <w:r>
               <w:rPr>
@@ -1410,7 +1895,7 @@
                 <w:noProof/>
                 <w:webHidden/>
               </w:rPr>
-              <w:t>37</w:t>
+              <w:t>39</w:t>
             </w:r>
             <w:r>
               <w:rPr>
@@ -1432,7 +1917,7 @@
               <w:noProof/>
             </w:rPr>
           </w:pPr>
-          <w:hyperlink w:anchor="_Toc233917685" w:history="1">
+          <w:hyperlink w:anchor="_Toc233919964" w:history="1">
             <w:r>
               <w:rPr>
                 <w:rStyle w:val="Hyperlink"/>
@@ -1459,7 +1944,7 @@
                 <w:noProof/>
                 <w:webHidden/>
               </w:rPr>
-              <w:instrText xml:space="preserve"> PAGEREF _Toc233917685 \h </w:instrText>
+              <w:instrText xml:space="preserve"> PAGEREF _Toc233919964 \h </w:instrText>
             </w:r>
             <w:r>
               <w:rPr>
@@ -1479,7 +1964,7 @@
                 <w:noProof/>
                 <w:webHidden/>
               </w:rPr>
-              <w:t>41</w:t>
+              <w:t>43</w:t>
             </w:r>
             <w:r>
               <w:rPr>
@@ -1501,7 +1986,7 @@
               <w:noProof/>
             </w:rPr>
           </w:pPr>
-          <w:hyperlink w:anchor="_Toc233917686" w:history="1">
+          <w:hyperlink w:anchor="_Toc233919965" w:history="1">
             <w:r>
               <w:rPr>
                 <w:rStyle w:val="Hyperlink"/>
@@ -1528,7 +2013,7 @@
                 <w:noProof/>
                 <w:webHidden/>
               </w:rPr>
-              <w:instrText xml:space="preserve"> PAGEREF _Toc233917686 \h </w:instrText>
+              <w:instrText xml:space="preserve"> PAGEREF _Toc233919965 \h </w:instrText>
             </w:r>
             <w:r>
               <w:rPr>
@@ -1548,7 +2033,7 @@
                 <w:noProof/>
                 <w:webHidden/>
               </w:rPr>
-              <w:t>41</w:t>
+              <w:t>43</w:t>
             </w:r>
             <w:r>
               <w:rPr>
@@ -1570,7 +2055,7 @@
               <w:noProof/>
             </w:rPr>
           </w:pPr>
-          <w:hyperlink w:anchor="_Toc233917687" w:history="1">
+          <w:hyperlink w:anchor="_Toc233919966" w:history="1">
             <w:r>
               <w:rPr>
                 <w:rStyle w:val="Hyperlink"/>
@@ -1597,7 +2082,7 @@
                 <w:noProof/>
                 <w:webHidden/>
               </w:rPr>
-              <w:instrText xml:space="preserve"> PAGEREF _Toc233917687 \h </w:instrText>
+              <w:instrText xml:space="preserve"> PAGEREF _Toc233919966 \h </w:instrText>
             </w:r>
             <w:r>
               <w:rPr>
@@ -1617,7 +2102,7 @@
                 <w:noProof/>
                 <w:webHidden/>
               </w:rPr>
-              <w:t>42</w:t>
+              <w:t>44</w:t>
             </w:r>
             <w:r>
               <w:rPr>
@@ -1639,7 +2124,7 @@
               <w:noProof/>
             </w:rPr>
           </w:pPr>
-          <w:hyperlink w:anchor="_Toc233917688" w:history="1">
+          <w:hyperlink w:anchor="_Toc233919967" w:history="1">
             <w:r>
               <w:rPr>
                 <w:rStyle w:val="Hyperlink"/>
@@ -1666,7 +2151,7 @@
                 <w:noProof/>
                 <w:webHidden/>
               </w:rPr>
-              <w:instrText xml:space="preserve"> PAGEREF _Toc233917688 \h </w:instrText>
+              <w:instrText xml:space="preserve"> PAGEREF _Toc233919967 \h </w:instrText>
             </w:r>
             <w:r>
               <w:rPr>
@@ -1686,7 +2171,7 @@
                 <w:noProof/>
                 <w:webHidden/>
               </w:rPr>
-              <w:t>42</w:t>
+              <w:t>44</w:t>
             </w:r>
             <w:r>
               <w:rPr>
@@ -1708,7 +2193,7 @@
               <w:noProof/>
             </w:rPr>
           </w:pPr>
-          <w:hyperlink w:anchor="_Toc233917689" w:history="1">
+          <w:hyperlink w:anchor="_Toc233919968" w:history="1">
             <w:r>
               <w:rPr>
                 <w:rStyle w:val="Hyperlink"/>
@@ -1735,7 +2220,7 @@
                 <w:noProof/>
                 <w:webHidden/>
               </w:rPr>
-              <w:instrText xml:space="preserve"> PAGEREF _Toc233917689 \h </w:instrText>
+              <w:instrText xml:space="preserve"> PAGEREF _Toc233919968 \h </w:instrText>
             </w:r>
             <w:r>
               <w:rPr>
@@ -1755,7 +2240,7 @@
                 <w:noProof/>
                 <w:webHidden/>
               </w:rPr>
-              <w:t>42</w:t>
+              <w:t>44</w:t>
             </w:r>
             <w:r>
               <w:rPr>
@@ -1777,7 +2262,7 @@
               <w:noProof/>
             </w:rPr>
           </w:pPr>
-          <w:hyperlink w:anchor="_Toc233917690" w:history="1">
+          <w:hyperlink w:anchor="_Toc233919969" w:history="1">
             <w:r>
               <w:rPr>
                 <w:rStyle w:val="Hyperlink"/>
@@ -1804,7 +2289,7 @@
                 <w:noProof/>
                 <w:webHidden/>
               </w:rPr>
-              <w:instrText xml:space="preserve"> PAGEREF _Toc233917690 \h </w:instrText>
+              <w:instrText xml:space="preserve"> PAGEREF _Toc233919969 \h </w:instrText>
             </w:r>
             <w:r>
               <w:rPr>
@@ -1824,7 +2309,7 @@
                 <w:noProof/>
                 <w:webHidden/>
               </w:rPr>
-              <w:t>42</w:t>
+              <w:t>44</w:t>
             </w:r>
             <w:r>
               <w:rPr>
@@ -1846,7 +2331,7 @@
               <w:noProof/>
             </w:rPr>
           </w:pPr>
-          <w:hyperlink w:anchor="_Toc233917691" w:history="1">
+          <w:hyperlink w:anchor="_Toc233919970" w:history="1">
             <w:r>
               <w:rPr>
                 <w:rStyle w:val="Hyperlink"/>
@@ -1873,7 +2358,7 @@
                 <w:noProof/>
                 <w:webHidden/>
               </w:rPr>
-              <w:instrText xml:space="preserve"> PAGEREF _Toc233917691 \h </w:instrText>
+              <w:instrText xml:space="preserve"> PAGEREF _Toc233919970 \h </w:instrText>
             </w:r>
             <w:r>
               <w:rPr>
@@ -1893,7 +2378,7 @@
                 <w:noProof/>
                 <w:webHidden/>
               </w:rPr>
-              <w:t>42</w:t>
+              <w:t>44</w:t>
             </w:r>
             <w:r>
               <w:rPr>
@@ -1915,7 +2400,7 @@
               <w:noProof/>
             </w:rPr>
           </w:pPr>
-          <w:hyperlink w:anchor="_Toc233917692" w:history="1">
+          <w:hyperlink w:anchor="_Toc233919971" w:history="1">
             <w:r>
               <w:rPr>
                 <w:rStyle w:val="Hyperlink"/>
@@ -1942,7 +2427,7 @@
                 <w:noProof/>
                 <w:webHidden/>
               </w:rPr>
-              <w:instrText xml:space="preserve"> PAGEREF _Toc233917692 \h </w:instrText>
+              <w:instrText xml:space="preserve"> PAGEREF _Toc233919971 \h </w:instrText>
             </w:r>
             <w:r>
               <w:rPr>
@@ -1962,7 +2447,7 @@
                 <w:noProof/>
                 <w:webHidden/>
               </w:rPr>
-              <w:t>42</w:t>
+              <w:t>44</w:t>
             </w:r>
             <w:r>
               <w:rPr>
@@ -1984,7 +2469,7 @@
               <w:noProof/>
             </w:rPr>
           </w:pPr>
-          <w:hyperlink w:anchor="_Toc233917693" w:history="1">
+          <w:hyperlink w:anchor="_Toc233919972" w:history="1">
             <w:r>
               <w:rPr>
                 <w:rStyle w:val="Hyperlink"/>
@@ -2011,7 +2496,7 @@
                 <w:noProof/>
                 <w:webHidden/>
               </w:rPr>
-              <w:instrText xml:space="preserve"> PAGEREF _Toc233917693 \h </w:instrText>
+              <w:instrText xml:space="preserve"> PAGEREF _Toc233919972 \h </w:instrText>
             </w:r>
             <w:r>
               <w:rPr>
@@ -2031,7 +2516,145 @@
                 <w:noProof/>
                 <w:webHidden/>
               </w:rPr>
-              <w:t>42</w:t>
+              <w:t>44</w:t>
+            </w:r>
+            <w:r>
+              <w:rPr>
+                <w:noProof/>
+                <w:webHidden/>
+              </w:rPr>
+              <w:fldChar w:fldCharType="end"/>
+            </w:r>
+          </w:hyperlink>
+        </w:p>
+        <w:p>
+          <w:pPr>
+            <w:pStyle w:val="TOC2"/>
+            <w:tabs>
+              <w:tab w:val="right" w:leader="dot" w:pos="9350"/>
+            </w:tabs>
+            <w:rPr>
+              <w:rFonts w:eastAsiaTheme="minorEastAsia"/>
+              <w:noProof/>
+            </w:rPr>
+          </w:pPr>
+          <w:hyperlink w:anchor="_Toc233919973" w:history="1">
+            <w:r>
+              <w:rPr>
+                <w:rStyle w:val="Hyperlink"/>
+                <w:noProof/>
+              </w:rPr>
+              <w:t>5. Documentation:</w:t>
+            </w:r>
+            <w:r>
+              <w:rPr>
+                <w:noProof/>
+                <w:webHidden/>
+              </w:rPr>
+              <w:tab/>
+            </w:r>
+            <w:r>
+              <w:rPr>
+                <w:noProof/>
+                <w:webHidden/>
+              </w:rPr>
+              <w:fldChar w:fldCharType="begin"/>
+            </w:r>
+            <w:r>
+              <w:rPr>
+                <w:noProof/>
+                <w:webHidden/>
+              </w:rPr>
+              <w:instrText xml:space="preserve"> PAGEREF _Toc233919973 \h </w:instrText>
+            </w:r>
+            <w:r>
+              <w:rPr>
+                <w:noProof/>
+                <w:webHidden/>
+              </w:rPr>
+            </w:r>
+            <w:r>
+              <w:rPr>
+                <w:noProof/>
+                <w:webHidden/>
+              </w:rPr>
+              <w:fldChar w:fldCharType="separate"/>
+            </w:r>
+            <w:r>
+              <w:rPr>
+                <w:noProof/>
+                <w:webHidden/>
+              </w:rPr>
+              <w:t>52</w:t>
+            </w:r>
+            <w:r>
+              <w:rPr>
+                <w:noProof/>
+                <w:webHidden/>
+              </w:rPr>
+              <w:fldChar w:fldCharType="end"/>
+            </w:r>
+          </w:hyperlink>
+        </w:p>
+        <w:p>
+          <w:pPr>
+            <w:pStyle w:val="TOC3"/>
+            <w:tabs>
+              <w:tab w:val="right" w:leader="dot" w:pos="9350"/>
+            </w:tabs>
+            <w:rPr>
+              <w:rFonts w:eastAsiaTheme="minorEastAsia"/>
+              <w:noProof/>
+            </w:rPr>
+          </w:pPr>
+          <w:hyperlink w:anchor="_Toc233919974" w:history="1">
+            <w:r>
+              <w:rPr>
+                <w:rStyle w:val="Hyperlink"/>
+                <w:noProof/>
+              </w:rPr>
+              <w:t>- Update the README.md file with instructions on how the GitHub Actions workflow works and how to configure the necessary secrets.</w:t>
+            </w:r>
+            <w:r>
+              <w:rPr>
+                <w:noProof/>
+                <w:webHidden/>
+              </w:rPr>
+              <w:tab/>
+            </w:r>
+            <w:r>
+              <w:rPr>
+                <w:noProof/>
+                <w:webHidden/>
+              </w:rPr>
+              <w:fldChar w:fldCharType="begin"/>
+            </w:r>
+            <w:r>
+              <w:rPr>
+                <w:noProof/>
+                <w:webHidden/>
+              </w:rPr>
+              <w:instrText xml:space="preserve"> PAGEREF _Toc233919974 \h </w:instrText>
+            </w:r>
+            <w:r>
+              <w:rPr>
+                <w:noProof/>
+                <w:webHidden/>
+              </w:rPr>
+            </w:r>
+            <w:r>
+              <w:rPr>
+                <w:noProof/>
+                <w:webHidden/>
+              </w:rPr>
+              <w:fldChar w:fldCharType="separate"/>
+            </w:r>
+            <w:r>
+              <w:rPr>
+                <w:noProof/>
+                <w:webHidden/>
+              </w:rPr>
+              <w:t>52</w:t>
             </w:r>
             <w:r>
               <w:rPr>
@@ -2061,34 +2684,60 @@
     <w:p/>
     <w:p/>
     <w:p/>
-    <w:p/>
-    <w:p/>
-    <w:p/>
-    <w:p/>
-    <w:p/>
-    <w:p/>
-    <w:p/>
-    <w:p/>
     <w:p>
       <w:pPr>
         <w:pStyle w:val="Heading1"/>
       </w:pPr>
-      <w:bookmarkStart w:id="0" w:name="_Toc233917665"/>
+      <w:bookmarkStart w:id="0" w:name="_Toc233919937"/>
       <w:r>
         <w:lastRenderedPageBreak/>
+        <w:t>GitH</w:t>
+      </w:r>
+      <w:r>
+        <w:t>u</w:t>
+      </w:r>
+      <w:r>
+        <w:t xml:space="preserve">b Repo: </w:t>
+      </w:r>
+      <w:hyperlink r:id="rId5" w:history="1">
+        <w:r>
+          <w:rPr>
+            <w:rStyle w:val="Hyperlink"/>
+          </w:rPr>
+          <w:t>https://github</w:t>
+        </w:r>
+      </w:hyperlink>
+      <w:r>
+        <w:t>.com</w:t>
+      </w:r>
+      <w:r>
+        <w:t>/ApoorvaD90</w:t>
+      </w:r>
+      <w:r>
+        <w:t>/Devops_CI_CD_Pipeline</w:t>
+      </w:r>
+      <w:bookmarkEnd w:id="0"/>
+    </w:p>
+    <w:p/>
+    <w:p>
+      <w:pPr>
+        <w:pStyle w:val="Heading1"/>
+      </w:pPr>
+      <w:bookmarkStart w:id="1" w:name="_Toc233919938"/>
+      <w:r>
         <w:t>1. Jenkins CI CD pipeline for flask application</w:t>
       </w:r>
-      <w:bookmarkEnd w:id="0"/>
+      <w:bookmarkEnd w:id="1"/>
     </w:p>
     <w:p>
       <w:pPr>
         <w:pStyle w:val="Heading2"/>
       </w:pPr>
-      <w:bookmarkStart w:id="1" w:name="_Toc233917666"/>
+      <w:bookmarkStart w:id="2" w:name="_Toc233919939"/>
       <w:r>
         <w:t>1. Setup:</w:t>
       </w:r>
-      <w:bookmarkEnd w:id="1"/>
+      <w:bookmarkEnd w:id="2"/>
     </w:p>
     <w:p>
       <w:pPr>
@@ -2097,11 +2746,11 @@
       <w:r>
         <w:t>   </w:t>
       </w:r>
-      <w:bookmarkStart w:id="2" w:name="_Toc233917667"/>
+      <w:bookmarkStart w:id="3" w:name="_Toc233919940"/>
       <w:r>
         <w:t>- Install Jenkins on a virtual machine or use a cloud-based Jenkins service.</w:t>
       </w:r>
-      <w:bookmarkEnd w:id="2"/>
+      <w:bookmarkEnd w:id="3"/>
     </w:p>
     <w:p>
       <w:pPr>
@@ -2110,11 +2759,11 @@
       <w:r>
         <w:t>   </w:t>
       </w:r>
-      <w:bookmarkStart w:id="3" w:name="_Toc233917668"/>
+      <w:bookmarkStart w:id="4" w:name="_Toc233919941"/>
       <w:r>
         <w:t>- Configure Jenkins with Python and any necessary libraries.</w:t>
       </w:r>
-      <w:bookmarkEnd w:id="3"/>
+      <w:bookmarkEnd w:id="4"/>
     </w:p>
     <w:p/>
     <w:p>
@@ -2146,7 +2795,7 @@
                     <pic:cNvPicPr/>
                   </pic:nvPicPr>
                   <pic:blipFill>
-                    <a:blip r:embed="rId5"/>
+                    <a:blip r:embed="rId6"/>
                     <a:stretch>
                       <a:fillRect/>
                     </a:stretch>
@@ -2204,7 +2853,7 @@
                     <pic:cNvPicPr/>
                   </pic:nvPicPr>
                   <pic:blipFill>
-                    <a:blip r:embed="rId6"/>
+                    <a:blip r:embed="rId7"/>
                     <a:stretch>
                       <a:fillRect/>
                     </a:stretch>
@@ -2246,7 +2895,7 @@
                     <pic:cNvPicPr/>
                   </pic:nvPicPr>
                   <pic:blipFill>
-                    <a:blip r:embed="rId7"/>
+                    <a:blip r:embed="rId8"/>
                     <a:stretch>
                       <a:fillRect/>
                     </a:stretch>
@@ -2296,7 +2945,7 @@
                     <pic:cNvPicPr/>
                   </pic:nvPicPr>
                   <pic:blipFill>
-                    <a:blip r:embed="rId8"/>
+                    <a:blip r:embed="rId9"/>
                     <a:stretch>
                       <a:fillRect/>
                     </a:stretch>
@@ -2339,7 +2988,7 @@
                     <pic:cNvPicPr/>
                   </pic:nvPicPr>
                   <pic:blipFill>
-                    <a:blip r:embed="rId9"/>
+                    <a:blip r:embed="rId10"/>
                     <a:stretch>
                       <a:fillRect/>
                     </a:stretch>
@@ -2381,7 +3030,7 @@
                     <pic:cNvPicPr/>
                   </pic:nvPicPr>
                   <pic:blipFill>
-                    <a:blip r:embed="rId10"/>
+                    <a:blip r:embed="rId11"/>
                     <a:stretch>
                       <a:fillRect/>
                     </a:stretch>
@@ -2423,7 +3072,7 @@
                     <pic:cNvPicPr/>
                   </pic:nvPicPr>
                   <pic:blipFill>
-                    <a:blip r:embed="rId11"/>
+                    <a:blip r:embed="rId12"/>
                     <a:stretch>
                       <a:fillRect/>
                     </a:stretch>
@@ -2474,7 +3123,7 @@
                     <pic:cNvPicPr/>
                   </pic:nvPicPr>
                   <pic:blipFill>
-                    <a:blip r:embed="rId12"/>
+                    <a:blip r:embed="rId13"/>
                     <a:stretch>
                       <a:fillRect/>
                     </a:stretch>
@@ -2516,7 +3165,7 @@
                     <pic:cNvPicPr/>
                   </pic:nvPicPr>
                   <pic:blipFill>
-                    <a:blip r:embed="rId13"/>
+                    <a:blip r:embed="rId14"/>
                     <a:stretch>
                       <a:fillRect/>
                     </a:stretch>
@@ -2566,7 +3215,7 @@
                     <pic:cNvPicPr/>
                   </pic:nvPicPr>
                   <pic:blipFill>
-                    <a:blip r:embed="rId14"/>
+                    <a:blip r:embed="rId15"/>
                     <a:stretch>
                       <a:fillRect/>
                     </a:stretch>
@@ -2618,7 +3267,7 @@
                     <pic:cNvPicPr/>
                   </pic:nvPicPr>
                   <pic:blipFill>
-                    <a:blip r:embed="rId15"/>
+                    <a:blip r:embed="rId16"/>
                     <a:stretch>
                       <a:fillRect/>
                     </a:stretch>
@@ -2669,7 +3318,7 @@
                     <pic:cNvPicPr/>
                   </pic:nvPicPr>
                   <pic:blipFill>
-                    <a:blip r:embed="rId16"/>
+                    <a:blip r:embed="rId17"/>
                     <a:stretch>
                       <a:fillRect/>
                     </a:stretch>
@@ -2713,7 +3362,7 @@
                     <pic:cNvPicPr/>
                   </pic:nvPicPr>
                   <pic:blipFill>
-                    <a:blip r:embed="rId17"/>
+                    <a:blip r:embed="rId18"/>
                     <a:stretch>
                       <a:fillRect/>
                     </a:stretch>
@@ -2756,7 +3405,7 @@
                     <pic:cNvPicPr/>
                   </pic:nvPicPr>
                   <pic:blipFill>
-                    <a:blip r:embed="rId18"/>
+                    <a:blip r:embed="rId19"/>
                     <a:stretch>
                       <a:fillRect/>
                     </a:stretch>
@@ -2800,7 +3449,7 @@
                     <pic:cNvPicPr/>
                   </pic:nvPicPr>
                   <pic:blipFill>
-                    <a:blip r:embed="rId19"/>
+                    <a:blip r:embed="rId20"/>
                     <a:stretch>
                       <a:fillRect/>
                     </a:stretch>
@@ -2825,11 +3474,11 @@
       <w:pPr>
         <w:pStyle w:val="Heading2"/>
       </w:pPr>
-      <w:bookmarkStart w:id="4" w:name="_Toc233917669"/>
+      <w:bookmarkStart w:id="5" w:name="_Toc233919942"/>
       <w:r>
         <w:t>2. Source Code:</w:t>
       </w:r>
-      <w:bookmarkEnd w:id="4"/>
+      <w:bookmarkEnd w:id="5"/>
     </w:p>
     <w:p>
       <w:pPr>
@@ -2838,11 +3487,11 @@
       <w:r>
         <w:t xml:space="preserve">  </w:t>
       </w:r>
-      <w:bookmarkStart w:id="5" w:name="_Toc233917670"/>
+      <w:bookmarkStart w:id="6" w:name="_Toc233919943"/>
       <w:r>
         <w:t>- Fork the provided Python web application repository on GitHub (provide a link to a sample Python web application repository).</w:t>
       </w:r>
-      <w:bookmarkEnd w:id="5"/>
+      <w:bookmarkEnd w:id="6"/>
     </w:p>
     <w:p>
       <w:pPr>
@@ -2851,11 +3500,11 @@
       <w:r>
         <w:t xml:space="preserve">  </w:t>
       </w:r>
-      <w:bookmarkStart w:id="6" w:name="_Toc233917671"/>
+      <w:bookmarkStart w:id="7" w:name="_Toc233919944"/>
       <w:r>
         <w:t>- Clone the forked repository into your Jenkins server.</w:t>
       </w:r>
-      <w:bookmarkEnd w:id="6"/>
+      <w:bookmarkEnd w:id="7"/>
     </w:p>
     <w:p/>
     <w:p>
@@ -2890,7 +3539,7 @@
                     <pic:cNvPicPr/>
                   </pic:nvPicPr>
                   <pic:blipFill>
-                    <a:blip r:embed="rId20"/>
+                    <a:blip r:embed="rId21"/>
                     <a:stretch>
                       <a:fillRect/>
                     </a:stretch>
@@ -2944,7 +3593,7 @@
                     <pic:cNvPicPr/>
                   </pic:nvPicPr>
                   <pic:blipFill>
-                    <a:blip r:embed="rId21"/>
+                    <a:blip r:embed="rId22"/>
                     <a:stretch>
                       <a:fillRect/>
                     </a:stretch>
@@ -2987,7 +3636,7 @@
                     <pic:cNvPicPr/>
                   </pic:nvPicPr>
                   <pic:blipFill>
-                    <a:blip r:embed="rId22"/>
+                    <a:blip r:embed="rId23"/>
                     <a:stretch>
                       <a:fillRect/>
                     </a:stretch>
@@ -3053,7 +3702,7 @@
                     <pic:cNvPicPr/>
                   </pic:nvPicPr>
                   <pic:blipFill>
-                    <a:blip r:embed="rId23"/>
+                    <a:blip r:embed="rId24"/>
                     <a:stretch>
                       <a:fillRect/>
                     </a:stretch>
@@ -3096,7 +3745,7 @@
                     <pic:cNvPicPr/>
                   </pic:nvPicPr>
                   <pic:blipFill>
-                    <a:blip r:embed="rId24"/>
+                    <a:blip r:embed="rId25"/>
                     <a:stretch>
                       <a:fillRect/>
                     </a:stretch>
@@ -3147,7 +3796,7 @@
                     <pic:cNvPicPr/>
                   </pic:nvPicPr>
                   <pic:blipFill>
-                    <a:blip r:embed="rId25"/>
+                    <a:blip r:embed="rId26"/>
                     <a:stretch>
                       <a:fillRect/>
                     </a:stretch>
@@ -3190,7 +3839,7 @@
                     <pic:cNvPicPr/>
                   </pic:nvPicPr>
                   <pic:blipFill>
-                    <a:blip r:embed="rId26"/>
+                    <a:blip r:embed="rId27"/>
                     <a:stretch>
                       <a:fillRect/>
                     </a:stretch>
@@ -3232,7 +3881,7 @@
                     <pic:cNvPicPr/>
                   </pic:nvPicPr>
                   <pic:blipFill>
-                    <a:blip r:embed="rId27"/>
+                    <a:blip r:embed="rId28"/>
                     <a:stretch>
                       <a:fillRect/>
                     </a:stretch>
@@ -3269,11 +3918,11 @@
       <w:pPr>
         <w:pStyle w:val="Heading2"/>
       </w:pPr>
-      <w:bookmarkStart w:id="7" w:name="_Toc233917672"/>
+      <w:bookmarkStart w:id="8" w:name="_Toc233919945"/>
       <w:r>
         <w:t>3. Jenkins Pipeline:</w:t>
       </w:r>
-      <w:bookmarkEnd w:id="7"/>
+      <w:bookmarkEnd w:id="8"/>
     </w:p>
     <w:p>
       <w:pPr>
@@ -3282,19 +3931,11 @@
       <w:r>
         <w:t>   </w:t>
       </w:r>
-      <w:bookmarkStart w:id="8" w:name="_Toc233917673"/>
-      <w:r>
-        <w:t xml:space="preserve">- Create a </w:t>
-      </w:r>
-      <w:proofErr w:type="spellStart"/>
-      <w:r>
-        <w:t>Jenkinsfile</w:t>
-      </w:r>
-      <w:proofErr w:type="spellEnd"/>
-      <w:r>
-        <w:t xml:space="preserve"> in the root of your Python application repository.</w:t>
-      </w:r>
-      <w:bookmarkEnd w:id="8"/>
+      <w:bookmarkStart w:id="9" w:name="_Toc233919946"/>
+      <w:r>
+        <w:t>- Create a Jenkinsfile in the root of your Python application repository.</w:t>
+      </w:r>
+      <w:bookmarkEnd w:id="9"/>
     </w:p>
     <w:p>
       <w:pPr>
@@ -3303,11 +3944,11 @@
       <w:r>
         <w:t>   </w:t>
       </w:r>
-      <w:bookmarkStart w:id="9" w:name="_Toc233917674"/>
+      <w:bookmarkStart w:id="10" w:name="_Toc233919947"/>
       <w:r>
         <w:t>- Define a pipeline with the following stages:</w:t>
       </w:r>
-      <w:bookmarkEnd w:id="9"/>
+      <w:bookmarkEnd w:id="10"/>
     </w:p>
     <w:p>
       <w:pPr>
@@ -3316,11 +3957,11 @@
       <w:r>
         <w:t xml:space="preserve">    </w:t>
       </w:r>
-      <w:bookmarkStart w:id="10" w:name="_Toc233917675"/>
+      <w:bookmarkStart w:id="11" w:name="_Toc233919948"/>
       <w:r>
         <w:t>- Build: Install dependencies using pip.</w:t>
       </w:r>
-      <w:bookmarkEnd w:id="10"/>
+      <w:bookmarkEnd w:id="11"/>
     </w:p>
     <w:p>
       <w:pPr>
@@ -3329,19 +3970,11 @@
       <w:r>
         <w:t xml:space="preserve">    </w:t>
       </w:r>
-      <w:bookmarkStart w:id="11" w:name="_Toc233917676"/>
-      <w:r>
-        <w:t xml:space="preserve">- Test: Run unit tests using a testing framework like </w:t>
-      </w:r>
-      <w:proofErr w:type="spellStart"/>
-      <w:r>
-        <w:t>pytest</w:t>
-      </w:r>
-      <w:proofErr w:type="spellEnd"/>
-      <w:r>
-        <w:t>.</w:t>
-      </w:r>
-      <w:bookmarkEnd w:id="11"/>
+      <w:bookmarkStart w:id="12" w:name="_Toc233919949"/>
+      <w:r>
+        <w:t>- Test: Run unit tests using a testing framework like pytest.</w:t>
+      </w:r>
+      <w:bookmarkEnd w:id="12"/>
     </w:p>
     <w:p>
       <w:pPr>
@@ -3350,24 +3983,19 @@
       <w:r>
         <w:t xml:space="preserve">    </w:t>
       </w:r>
-      <w:bookmarkStart w:id="12" w:name="_Toc233917677"/>
+      <w:bookmarkStart w:id="13" w:name="_Toc233919950"/>
       <w:r>
         <w:t>- Deploy: If tests pass, deploy the application to a staging environment.</w:t>
       </w:r>
-      <w:bookmarkEnd w:id="12"/>
+      <w:bookmarkEnd w:id="13"/>
     </w:p>
     <w:p/>
     <w:p>
       <w:pPr>
         <w:pStyle w:val="Heading4"/>
       </w:pPr>
-      <w:proofErr w:type="spellStart"/>
-      <w:r>
-        <w:t>Jenkinsfile</w:t>
-      </w:r>
-      <w:proofErr w:type="spellEnd"/>
-      <w:r>
-        <w:t xml:space="preserve"> created in the repo</w:t>
+      <w:r>
+        <w:t>Jenkinsfile created in the repo</w:t>
       </w:r>
     </w:p>
     <w:p>
@@ -3391,7 +4019,7 @@
                     <pic:cNvPicPr/>
                   </pic:nvPicPr>
                   <pic:blipFill>
-                    <a:blip r:embed="rId28"/>
+                    <a:blip r:embed="rId29"/>
                     <a:stretch>
                       <a:fillRect/>
                     </a:stretch>
@@ -3448,7 +4076,7 @@
                     <pic:cNvPicPr/>
                   </pic:nvPicPr>
                   <pic:blipFill>
-                    <a:blip r:embed="rId29"/>
+                    <a:blip r:embed="rId30"/>
                     <a:stretch>
                       <a:fillRect/>
                     </a:stretch>
@@ -3490,7 +4118,7 @@
                     <pic:cNvPicPr/>
                   </pic:nvPicPr>
                   <pic:blipFill>
-                    <a:blip r:embed="rId30"/>
+                    <a:blip r:embed="rId31"/>
                     <a:stretch>
                       <a:fillRect/>
                     </a:stretch>
@@ -3533,7 +4161,7 @@
                     <pic:cNvPicPr/>
                   </pic:nvPicPr>
                   <pic:blipFill>
-                    <a:blip r:embed="rId31"/>
+                    <a:blip r:embed="rId32"/>
                     <a:stretch>
                       <a:fillRect/>
                     </a:stretch>
@@ -3575,7 +4203,7 @@
                     <pic:cNvPicPr/>
                   </pic:nvPicPr>
                   <pic:blipFill>
-                    <a:blip r:embed="rId32"/>
+                    <a:blip r:embed="rId33"/>
                     <a:stretch>
                       <a:fillRect/>
                     </a:stretch>
@@ -3618,7 +4246,7 @@
                     <pic:cNvPicPr/>
                   </pic:nvPicPr>
                   <pic:blipFill>
-                    <a:blip r:embed="rId33"/>
+                    <a:blip r:embed="rId34"/>
                     <a:stretch>
                       <a:fillRect/>
                     </a:stretch>
@@ -3669,7 +4297,7 @@
                     <pic:cNvPicPr/>
                   </pic:nvPicPr>
                   <pic:blipFill>
-                    <a:blip r:embed="rId34"/>
+                    <a:blip r:embed="rId35"/>
                     <a:stretch>
                       <a:fillRect/>
                     </a:stretch>
@@ -3713,7 +4341,7 @@
                     <pic:cNvPicPr/>
                   </pic:nvPicPr>
                   <pic:blipFill>
-                    <a:blip r:embed="rId35"/>
+                    <a:blip r:embed="rId36"/>
                     <a:stretch>
                       <a:fillRect/>
                     </a:stretch>
@@ -3763,7 +4391,7 @@
                     <pic:cNvPicPr/>
                   </pic:nvPicPr>
                   <pic:blipFill>
-                    <a:blip r:embed="rId36"/>
+                    <a:blip r:embed="rId37"/>
                     <a:stretch>
                       <a:fillRect/>
                     </a:stretch>
@@ -3821,7 +4449,7 @@
                     <pic:cNvPicPr/>
                   </pic:nvPicPr>
                   <pic:blipFill>
-                    <a:blip r:embed="rId37"/>
+                    <a:blip r:embed="rId38"/>
                     <a:stretch>
                       <a:fillRect/>
                     </a:stretch>
@@ -3863,7 +4491,7 @@
                     <pic:cNvPicPr/>
                   </pic:nvPicPr>
                   <pic:blipFill>
-                    <a:blip r:embed="rId38"/>
+                    <a:blip r:embed="rId39"/>
                     <a:stretch>
                       <a:fillRect/>
                     </a:stretch>
@@ -3906,7 +4534,7 @@
                     <pic:cNvPicPr/>
                   </pic:nvPicPr>
                   <pic:blipFill>
-                    <a:blip r:embed="rId39"/>
+                    <a:blip r:embed="rId40"/>
                     <a:stretch>
                       <a:fillRect/>
                     </a:stretch>
@@ -3949,7 +4577,7 @@
                     <pic:cNvPicPr/>
                   </pic:nvPicPr>
                   <pic:blipFill>
-                    <a:blip r:embed="rId40"/>
+                    <a:blip r:embed="rId41"/>
                     <a:stretch>
                       <a:fillRect/>
                     </a:stretch>
@@ -4006,7 +4634,7 @@
                     <pic:cNvPicPr/>
                   </pic:nvPicPr>
                   <pic:blipFill>
-                    <a:blip r:embed="rId41"/>
+                    <a:blip r:embed="rId42"/>
                     <a:stretch>
                       <a:fillRect/>
                     </a:stretch>
@@ -4057,7 +4685,7 @@
                     <pic:cNvPicPr/>
                   </pic:nvPicPr>
                   <pic:blipFill>
-                    <a:blip r:embed="rId42"/>
+                    <a:blip r:embed="rId43"/>
                     <a:stretch>
                       <a:fillRect/>
                     </a:stretch>
@@ -4100,7 +4728,7 @@
                     <pic:cNvPicPr/>
                   </pic:nvPicPr>
                   <pic:blipFill>
-                    <a:blip r:embed="rId43"/>
+                    <a:blip r:embed="rId44"/>
                     <a:stretch>
                       <a:fillRect/>
                     </a:stretch>
@@ -4142,7 +4770,7 @@
                     <pic:cNvPicPr/>
                   </pic:nvPicPr>
                   <pic:blipFill>
-                    <a:blip r:embed="rId44"/>
+                    <a:blip r:embed="rId45"/>
                     <a:stretch>
                       <a:fillRect/>
                     </a:stretch>
@@ -4200,7 +4828,7 @@
                     <pic:cNvPicPr/>
                   </pic:nvPicPr>
                   <pic:blipFill>
-                    <a:blip r:embed="rId45"/>
+                    <a:blip r:embed="rId46"/>
                     <a:stretch>
                       <a:fillRect/>
                     </a:stretch>
@@ -4251,7 +4879,7 @@
                     <pic:cNvPicPr/>
                   </pic:nvPicPr>
                   <pic:blipFill>
-                    <a:blip r:embed="rId46"/>
+                    <a:blip r:embed="rId47"/>
                     <a:stretch>
                       <a:fillRect/>
                     </a:stretch>
@@ -4304,7 +4932,7 @@
                     <pic:cNvPicPr/>
                   </pic:nvPicPr>
                   <pic:blipFill>
-                    <a:blip r:embed="rId47"/>
+                    <a:blip r:embed="rId48"/>
                     <a:stretch>
                       <a:fillRect/>
                     </a:stretch>
@@ -4348,7 +4976,7 @@
                     <pic:cNvPicPr/>
                   </pic:nvPicPr>
                   <pic:blipFill>
-                    <a:blip r:embed="rId48"/>
+                    <a:blip r:embed="rId49"/>
                     <a:stretch>
                       <a:fillRect/>
                     </a:stretch>
@@ -4390,7 +5018,7 @@
                     <pic:cNvPicPr/>
                   </pic:nvPicPr>
                   <pic:blipFill>
-                    <a:blip r:embed="rId49"/>
+                    <a:blip r:embed="rId50"/>
                     <a:stretch>
                       <a:fillRect/>
                     </a:stretch>
@@ -4428,17 +5056,9 @@
     </w:p>
     <w:p>
       <w:r>
-        <w:t xml:space="preserve">Obtained </w:t>
-      </w:r>
-      <w:proofErr w:type="spellStart"/>
-      <w:r>
-        <w:t>Jenkinsfile</w:t>
-      </w:r>
-      <w:proofErr w:type="spellEnd"/>
-      <w:r>
-        <w:t xml:space="preserve"> from git </w:t>
-      </w:r>
-      <w:hyperlink r:id="rId50" w:history="1">
+        <w:t xml:space="preserve">Obtained Jenkinsfile from git </w:t>
+      </w:r>
+      <w:hyperlink r:id="rId51" w:history="1">
         <w:r>
           <w:rPr>
             <w:rStyle w:val="Hyperlink"/>
@@ -4461,7 +5081,7 @@
       <w:r>
         <w:t xml:space="preserve">Running on </w:t>
       </w:r>
-      <w:hyperlink r:id="rId51" w:history="1">
+      <w:hyperlink r:id="rId52" w:history="1">
         <w:r>
           <w:rPr>
             <w:rStyle w:val="Hyperlink"/>
@@ -4470,15 +5090,7 @@
         </w:r>
       </w:hyperlink>
       <w:r>
-        <w:t xml:space="preserve"> in /var/lib/</w:t>
-      </w:r>
-      <w:proofErr w:type="spellStart"/>
-      <w:r>
-        <w:t>jenkins</w:t>
-      </w:r>
-      <w:proofErr w:type="spellEnd"/>
-      <w:r>
-        <w:t>/workspace/flask-jenkins-pipeline@2</w:t>
+        <w:t xml:space="preserve"> in /var/lib/jenkins/workspace/flask-jenkins-pipeline@2</w:t>
       </w:r>
     </w:p>
     <w:p>
@@ -4493,15 +5105,7 @@
     </w:p>
     <w:p>
       <w:r>
-        <w:t xml:space="preserve">[Pipeline] </w:t>
-      </w:r>
-      <w:proofErr w:type="gramStart"/>
-      <w:r>
-        <w:t>{ (</w:t>
-      </w:r>
-      <w:proofErr w:type="gramEnd"/>
-      <w:r>
-        <w:t>Declarative: Checkout SCM)</w:t>
+        <w:t>[Pipeline] { (Declarative: Checkout SCM)</w:t>
       </w:r>
     </w:p>
     <w:p>
@@ -4521,15 +5125,7 @@
     </w:p>
     <w:p>
       <w:r>
-        <w:t xml:space="preserve">using credential </w:t>
-      </w:r>
-      <w:proofErr w:type="spellStart"/>
-      <w:r>
-        <w:t>github</w:t>
-      </w:r>
-      <w:proofErr w:type="spellEnd"/>
-      <w:r>
-        <w:t>-credentials</w:t>
+        <w:t>using credential github-credentials</w:t>
       </w:r>
     </w:p>
     <w:p>
@@ -4540,40 +5136,6 @@
     <w:p>
       <w:r>
         <w:t xml:space="preserve">Cloning repository </w:t>
-      </w:r>
-      <w:hyperlink r:id="rId52" w:history="1">
-        <w:r>
-          <w:rPr>
-            <w:rStyle w:val="Hyperlink"/>
-          </w:rPr>
-          <w:t>https://github.com/ApoorvaD90/Devops_CI_CD_Pipeline</w:t>
-        </w:r>
-      </w:hyperlink>
-    </w:p>
-    <w:p>
-      <w:r>
-        <w:t xml:space="preserve"> &gt; git </w:t>
-      </w:r>
-      <w:proofErr w:type="spellStart"/>
-      <w:r>
-        <w:t>init</w:t>
-      </w:r>
-      <w:proofErr w:type="spellEnd"/>
-      <w:r>
-        <w:t xml:space="preserve"> /var/lib/</w:t>
-      </w:r>
-      <w:proofErr w:type="spellStart"/>
-      <w:r>
-        <w:t>jenkins</w:t>
-      </w:r>
-      <w:proofErr w:type="spellEnd"/>
-      <w:r>
-        <w:t>/workspace/flask-jenkins-pipeline@2 # timeout=10</w:t>
-      </w:r>
-    </w:p>
-    <w:p>
-      <w:r>
-        <w:t xml:space="preserve">Fetching upstream changes from </w:t>
       </w:r>
       <w:hyperlink r:id="rId53" w:history="1">
         <w:r>
@@ -4586,22 +5148,12 @@
     </w:p>
     <w:p>
       <w:r>
-        <w:t xml:space="preserve"> &gt; git --version # timeout=10</w:t>
-      </w:r>
-    </w:p>
-    <w:p>
-      <w:r>
-        <w:t xml:space="preserve"> &gt; git --version # 'git version 2.53.0'</w:t>
-      </w:r>
-    </w:p>
-    <w:p>
-      <w:r>
-        <w:t>using GIT_ASKPASS to set credentials GitHub PAT</w:t>
-      </w:r>
-    </w:p>
-    <w:p>
-      <w:r>
-        <w:t xml:space="preserve"> &gt; git fetch --tags --force --progress -- </w:t>
+        <w:t xml:space="preserve"> &gt; git init /var/lib/jenkins/workspace/flask-jenkins-pipeline@2 # timeout=10</w:t>
+      </w:r>
+    </w:p>
+    <w:p>
+      <w:r>
+        <w:t xml:space="preserve">Fetching upstream changes from </w:t>
       </w:r>
       <w:hyperlink r:id="rId54" w:history="1">
         <w:r>
@@ -4611,21 +5163,25 @@
           <w:t>https://github.com/ApoorvaD90/Devops_CI_CD_Pipeline</w:t>
         </w:r>
       </w:hyperlink>
-      <w:r>
-        <w:t xml:space="preserve"> +refs/heads/</w:t>
-      </w:r>
-      <w:proofErr w:type="gramStart"/>
-      <w:r>
-        <w:t>*:refs</w:t>
-      </w:r>
-      <w:proofErr w:type="gramEnd"/>
-      <w:r>
-        <w:t>/remotes/origin/* # timeout=10</w:t>
-      </w:r>
-    </w:p>
-    <w:p>
-      <w:r>
-        <w:t xml:space="preserve"> &gt; git config remote.origin.url </w:t>
+    </w:p>
+    <w:p>
+      <w:r>
+        <w:t xml:space="preserve"> &gt; git --version # timeout=10</w:t>
+      </w:r>
+    </w:p>
+    <w:p>
+      <w:r>
+        <w:t xml:space="preserve"> &gt; git --version # 'git version 2.53.0'</w:t>
+      </w:r>
+    </w:p>
+    <w:p>
+      <w:r>
+        <w:t>using GIT_ASKPASS to set credentials GitHub PAT</w:t>
+      </w:r>
+    </w:p>
+    <w:p>
+      <w:r>
+        <w:t xml:space="preserve"> &gt; git fetch --tags --force --progress -- </w:t>
       </w:r>
       <w:hyperlink r:id="rId55" w:history="1">
         <w:r>
@@ -4636,214 +5192,7 @@
         </w:r>
       </w:hyperlink>
       <w:r>
-        <w:t xml:space="preserve"> # timeout=10</w:t>
-      </w:r>
-    </w:p>
-    <w:p>
-      <w:r>
-        <w:t xml:space="preserve"> &gt; git config --add </w:t>
-      </w:r>
-      <w:proofErr w:type="spellStart"/>
-      <w:proofErr w:type="gramStart"/>
-      <w:r>
-        <w:t>remote.origin</w:t>
-      </w:r>
-      <w:proofErr w:type="gramEnd"/>
-      <w:r>
-        <w:t>.fetch</w:t>
-      </w:r>
-      <w:proofErr w:type="spellEnd"/>
-      <w:r>
-        <w:t xml:space="preserve"> +refs/heads/</w:t>
-      </w:r>
-      <w:proofErr w:type="gramStart"/>
-      <w:r>
-        <w:t>*:refs</w:t>
-      </w:r>
-      <w:proofErr w:type="gramEnd"/>
-      <w:r>
-        <w:t>/remotes/origin/* # timeout=10</w:t>
-      </w:r>
-    </w:p>
-    <w:p>
-      <w:r>
-        <w:t>Avoid second fetch</w:t>
-      </w:r>
-    </w:p>
-    <w:p>
-      <w:r>
-        <w:t xml:space="preserve"> &gt; git rev-parse refs/remotes/origin/main^{commit} # timeout=10</w:t>
-      </w:r>
-    </w:p>
-    <w:p>
-      <w:r>
-        <w:lastRenderedPageBreak/>
-        <w:t>Checking out Revision 8271884f23042753b4ca9ff0843d778acdac127c (refs/remotes/origin/main)</w:t>
-      </w:r>
-    </w:p>
-    <w:p>
-      <w:r>
-        <w:t xml:space="preserve"> &gt; git config </w:t>
-      </w:r>
-      <w:proofErr w:type="spellStart"/>
-      <w:proofErr w:type="gramStart"/>
-      <w:r>
-        <w:t>core.sparsecheckout</w:t>
-      </w:r>
-      <w:proofErr w:type="spellEnd"/>
-      <w:proofErr w:type="gramEnd"/>
-      <w:r>
-        <w:t xml:space="preserve"> # timeout=10</w:t>
-      </w:r>
-    </w:p>
-    <w:p>
-      <w:r>
-        <w:t xml:space="preserve"> &gt; git checkout -f 8271884f23042753b4ca9ff0843d778acdac127c # timeout=10</w:t>
-      </w:r>
-    </w:p>
-    <w:p>
-      <w:r>
-        <w:t>Commit message: "Test webhook trigger"</w:t>
-      </w:r>
-    </w:p>
-    <w:p>
-      <w:r>
-        <w:t xml:space="preserve"> &gt; git rev-list --no-walk 3d579f856339e3f77668389061ece64f3dbb61a1 # timeout=10</w:t>
-      </w:r>
-    </w:p>
-    <w:p>
-      <w:r>
-        <w:t>[Pipeline</w:t>
-      </w:r>
-      <w:proofErr w:type="gramStart"/>
-      <w:r>
-        <w:t>] }</w:t>
-      </w:r>
-      <w:proofErr w:type="gramEnd"/>
-    </w:p>
-    <w:p>
-      <w:r>
-        <w:t>[Pipeline] // stage</w:t>
-      </w:r>
-    </w:p>
-    <w:p>
-      <w:r>
-        <w:t xml:space="preserve">[Pipeline] </w:t>
-      </w:r>
-      <w:proofErr w:type="spellStart"/>
-      <w:r>
-        <w:t>withEnv</w:t>
-      </w:r>
-      <w:proofErr w:type="spellEnd"/>
-    </w:p>
-    <w:p>
-      <w:r>
-        <w:t>[Pipeline] {</w:t>
-      </w:r>
-    </w:p>
-    <w:p>
-      <w:r>
-        <w:t xml:space="preserve">[Pipeline] </w:t>
-      </w:r>
-      <w:proofErr w:type="spellStart"/>
-      <w:r>
-        <w:t>withEnv</w:t>
-      </w:r>
-      <w:proofErr w:type="spellEnd"/>
-    </w:p>
-    <w:p>
-      <w:r>
-        <w:t>[Pipeline] {</w:t>
-      </w:r>
-    </w:p>
-    <w:p>
-      <w:r>
-        <w:t>[Pipeline] stage</w:t>
-      </w:r>
-    </w:p>
-    <w:p>
-      <w:r>
-        <w:t xml:space="preserve">[Pipeline] </w:t>
-      </w:r>
-      <w:proofErr w:type="gramStart"/>
-      <w:r>
-        <w:t>{ (</w:t>
-      </w:r>
-      <w:proofErr w:type="gramEnd"/>
-      <w:r>
-        <w:t>Checkout)</w:t>
-      </w:r>
-    </w:p>
-    <w:p>
-      <w:r>
-        <w:t>[Pipeline] echo</w:t>
-      </w:r>
-    </w:p>
-    <w:p>
-      <w:r>
-        <w:t>Checking out source code...</w:t>
-      </w:r>
-    </w:p>
-    <w:p>
-      <w:r>
-        <w:t>[Pipeline] checkout</w:t>
-      </w:r>
-    </w:p>
-    <w:p>
-      <w:r>
-        <w:t>Selected Git installation does not exist. Using Default</w:t>
-      </w:r>
-    </w:p>
-    <w:p>
-      <w:r>
-        <w:t>The recommended git tool is: NONE</w:t>
-      </w:r>
-    </w:p>
-    <w:p>
-      <w:r>
-        <w:t xml:space="preserve">using credential </w:t>
-      </w:r>
-      <w:proofErr w:type="spellStart"/>
-      <w:r>
-        <w:t>github</w:t>
-      </w:r>
-      <w:proofErr w:type="spellEnd"/>
-      <w:r>
-        <w:t>-credentials</w:t>
-      </w:r>
-    </w:p>
-    <w:p>
-      <w:r>
-        <w:t xml:space="preserve"> &gt; git rev-parse --resolve-git-</w:t>
-      </w:r>
-      <w:proofErr w:type="spellStart"/>
-      <w:r>
-        <w:t>dir</w:t>
-      </w:r>
-      <w:proofErr w:type="spellEnd"/>
-      <w:r>
-        <w:t xml:space="preserve"> /var/lib/</w:t>
-      </w:r>
-      <w:proofErr w:type="spellStart"/>
-      <w:r>
-        <w:t>jenkins</w:t>
-      </w:r>
-      <w:proofErr w:type="spellEnd"/>
-      <w:r>
-        <w:t>/workspace/flask-jenkins-pipeline@2</w:t>
-      </w:r>
-      <w:proofErr w:type="gramStart"/>
-      <w:r>
-        <w:t>/.git</w:t>
-      </w:r>
-      <w:proofErr w:type="gramEnd"/>
-      <w:r>
-        <w:t xml:space="preserve"> # timeout=10</w:t>
-      </w:r>
-    </w:p>
-    <w:p>
-      <w:r>
-        <w:t>Fetching changes from the remote Git repository</w:t>
+        <w:t xml:space="preserve"> +refs/heads/*:refs/remotes/origin/* # timeout=10</w:t>
       </w:r>
     </w:p>
     <w:p>
@@ -4864,7 +5213,128 @@
     </w:p>
     <w:p>
       <w:r>
-        <w:t xml:space="preserve">Fetching upstream changes from </w:t>
+        <w:t xml:space="preserve"> &gt; git config --add remote.origin.fetch +refs/heads/*:refs/remotes/origin/* # timeout=10</w:t>
+      </w:r>
+    </w:p>
+    <w:p>
+      <w:r>
+        <w:t>Avoid second fetch</w:t>
+      </w:r>
+    </w:p>
+    <w:p>
+      <w:r>
+        <w:t xml:space="preserve"> &gt; git rev-parse refs/remotes/origin/main^{commit} # timeout=10</w:t>
+      </w:r>
+    </w:p>
+    <w:p>
+      <w:r>
+        <w:lastRenderedPageBreak/>
+        <w:t>Checking out Revision 8271884f23042753b4ca9ff0843d778acdac127c (refs/remotes/origin/main)</w:t>
+      </w:r>
+    </w:p>
+    <w:p>
+      <w:r>
+        <w:t xml:space="preserve"> &gt; git config core.sparsecheckout # timeout=10</w:t>
+      </w:r>
+    </w:p>
+    <w:p>
+      <w:r>
+        <w:t xml:space="preserve"> &gt; git checkout -f 8271884f23042753b4ca9ff0843d778acdac127c # timeout=10</w:t>
+      </w:r>
+    </w:p>
+    <w:p>
+      <w:r>
+        <w:t>Commit message: "Test webhook trigger"</w:t>
+      </w:r>
+    </w:p>
+    <w:p>
+      <w:r>
+        <w:t xml:space="preserve"> &gt; git rev-list --no-walk 3d579f856339e3f77668389061ece64f3dbb61a1 # timeout=10</w:t>
+      </w:r>
+    </w:p>
+    <w:p>
+      <w:r>
+        <w:t>[Pipeline] }</w:t>
+      </w:r>
+    </w:p>
+    <w:p>
+      <w:r>
+        <w:t>[Pipeline] // stage</w:t>
+      </w:r>
+    </w:p>
+    <w:p>
+      <w:r>
+        <w:t>[Pipeline] withEnv</w:t>
+      </w:r>
+    </w:p>
+    <w:p>
+      <w:r>
+        <w:t>[Pipeline] {</w:t>
+      </w:r>
+    </w:p>
+    <w:p>
+      <w:r>
+        <w:t>[Pipeline] withEnv</w:t>
+      </w:r>
+    </w:p>
+    <w:p>
+      <w:r>
+        <w:t>[Pipeline] {</w:t>
+      </w:r>
+    </w:p>
+    <w:p>
+      <w:r>
+        <w:t>[Pipeline] stage</w:t>
+      </w:r>
+    </w:p>
+    <w:p>
+      <w:r>
+        <w:t>[Pipeline] { (Checkout)</w:t>
+      </w:r>
+    </w:p>
+    <w:p>
+      <w:r>
+        <w:t>[Pipeline] echo</w:t>
+      </w:r>
+    </w:p>
+    <w:p>
+      <w:r>
+        <w:t>Checking out source code...</w:t>
+      </w:r>
+    </w:p>
+    <w:p>
+      <w:r>
+        <w:t>[Pipeline] checkout</w:t>
+      </w:r>
+    </w:p>
+    <w:p>
+      <w:r>
+        <w:t>Selected Git installation does not exist. Using Default</w:t>
+      </w:r>
+    </w:p>
+    <w:p>
+      <w:r>
+        <w:t>The recommended git tool is: NONE</w:t>
+      </w:r>
+    </w:p>
+    <w:p>
+      <w:r>
+        <w:t>using credential github-credentials</w:t>
+      </w:r>
+    </w:p>
+    <w:p>
+      <w:r>
+        <w:t xml:space="preserve"> &gt; git rev-parse --resolve-git-dir /var/lib/jenkins/workspace/flask-jenkins-pipeline@2/.git # timeout=10</w:t>
+      </w:r>
+    </w:p>
+    <w:p>
+      <w:r>
+        <w:t>Fetching changes from the remote Git repository</w:t>
+      </w:r>
+    </w:p>
+    <w:p>
+      <w:r>
+        <w:t xml:space="preserve"> &gt; git config remote.origin.url </w:t>
       </w:r>
       <w:hyperlink r:id="rId57" w:history="1">
         <w:r>
@@ -4874,26 +5344,13 @@
           <w:t>https://github.com/ApoorvaD90/Devops_CI_CD_Pipeline</w:t>
         </w:r>
       </w:hyperlink>
-    </w:p>
-    <w:p>
-      <w:r>
-        <w:t xml:space="preserve"> &gt; git --version # timeout=10</w:t>
-      </w:r>
-    </w:p>
-    <w:p>
-      <w:r>
-        <w:lastRenderedPageBreak/>
-        <w:t xml:space="preserve"> &gt; git --version # 'git version 2.53.0'</w:t>
-      </w:r>
-    </w:p>
-    <w:p>
-      <w:r>
-        <w:t>using GIT_ASKPASS to set credentials GitHub PAT</w:t>
-      </w:r>
-    </w:p>
-    <w:p>
-      <w:r>
-        <w:t xml:space="preserve"> &gt; git fetch --tags --force --progress -- </w:t>
+      <w:r>
+        <w:t xml:space="preserve"> # timeout=10</w:t>
+      </w:r>
+    </w:p>
+    <w:p>
+      <w:r>
+        <w:t xml:space="preserve">Fetching upstream changes from </w:t>
       </w:r>
       <w:hyperlink r:id="rId58" w:history="1">
         <w:r>
@@ -4903,16 +5360,37 @@
           <w:t>https://github.com/ApoorvaD90/Devops_CI_CD_Pipeline</w:t>
         </w:r>
       </w:hyperlink>
-      <w:r>
-        <w:t xml:space="preserve"> +refs/heads/</w:t>
-      </w:r>
-      <w:proofErr w:type="gramStart"/>
-      <w:r>
-        <w:t>*:refs</w:t>
-      </w:r>
-      <w:proofErr w:type="gramEnd"/>
-      <w:r>
-        <w:t>/remotes/origin/* # timeout=10</w:t>
+    </w:p>
+    <w:p>
+      <w:r>
+        <w:t xml:space="preserve"> &gt; git --version # timeout=10</w:t>
+      </w:r>
+    </w:p>
+    <w:p>
+      <w:r>
+        <w:lastRenderedPageBreak/>
+        <w:t xml:space="preserve"> &gt; git --version # 'git version 2.53.0'</w:t>
+      </w:r>
+    </w:p>
+    <w:p>
+      <w:r>
+        <w:t>using GIT_ASKPASS to set credentials GitHub PAT</w:t>
+      </w:r>
+    </w:p>
+    <w:p>
+      <w:r>
+        <w:t xml:space="preserve"> &gt; git fetch --tags --force --progress -- </w:t>
+      </w:r>
+      <w:hyperlink r:id="rId59" w:history="1">
+        <w:r>
+          <w:rPr>
+            <w:rStyle w:val="Hyperlink"/>
+          </w:rPr>
+          <w:t>https://github.com/ApoorvaD90/Devops_CI_CD_Pipeline</w:t>
+        </w:r>
+      </w:hyperlink>
+      <w:r>
+        <w:t xml:space="preserve"> +refs/heads/*:refs/remotes/origin/* # timeout=10</w:t>
       </w:r>
     </w:p>
     <w:p>
@@ -4927,17 +5405,7 @@
     </w:p>
     <w:p>
       <w:r>
-        <w:t xml:space="preserve"> &gt; git config </w:t>
-      </w:r>
-      <w:proofErr w:type="spellStart"/>
-      <w:proofErr w:type="gramStart"/>
-      <w:r>
-        <w:t>core.sparsecheckout</w:t>
-      </w:r>
-      <w:proofErr w:type="spellEnd"/>
-      <w:proofErr w:type="gramEnd"/>
-      <w:r>
-        <w:t xml:space="preserve"> # timeout=10</w:t>
+        <w:t xml:space="preserve"> &gt; git config core.sparsecheckout # timeout=10</w:t>
       </w:r>
     </w:p>
     <w:p>
@@ -4952,13 +5420,8 @@
     </w:p>
     <w:p>
       <w:r>
-        <w:t>[Pipeline</w:t>
-      </w:r>
-      <w:proofErr w:type="gramStart"/>
-      <w:r>
-        <w:t>] }</w:t>
-      </w:r>
-      <w:proofErr w:type="gramEnd"/>
+        <w:t>[Pipeline] }</w:t>
+      </w:r>
     </w:p>
     <w:p>
       <w:r>
@@ -4972,15 +5435,7 @@
     </w:p>
     <w:p>
       <w:r>
-        <w:t xml:space="preserve">[Pipeline] </w:t>
-      </w:r>
-      <w:proofErr w:type="gramStart"/>
-      <w:r>
-        <w:t>{ (</w:t>
-      </w:r>
-      <w:proofErr w:type="gramEnd"/>
-      <w:r>
-        <w:t>Build)</w:t>
+        <w:t>[Pipeline] { (Build)</w:t>
       </w:r>
     </w:p>
     <w:p>
@@ -4995,43 +5450,17 @@
     </w:p>
     <w:p>
       <w:r>
-        <w:t xml:space="preserve">[Pipeline] </w:t>
-      </w:r>
-      <w:proofErr w:type="spellStart"/>
-      <w:r>
-        <w:t>sh</w:t>
-      </w:r>
-      <w:proofErr w:type="spellEnd"/>
-    </w:p>
-    <w:p>
-      <w:r>
-        <w:t xml:space="preserve">+ python3 -m </w:t>
-      </w:r>
-      <w:proofErr w:type="spellStart"/>
-      <w:r>
-        <w:t>venv</w:t>
-      </w:r>
-      <w:proofErr w:type="spellEnd"/>
-      <w:r>
-        <w:t xml:space="preserve"> </w:t>
-      </w:r>
-      <w:proofErr w:type="spellStart"/>
-      <w:r>
-        <w:t>venv</w:t>
-      </w:r>
-      <w:proofErr w:type="spellEnd"/>
-    </w:p>
-    <w:p>
-      <w:r>
-        <w:t xml:space="preserve">+ . </w:t>
-      </w:r>
-      <w:proofErr w:type="spellStart"/>
-      <w:r>
-        <w:t>venv</w:t>
-      </w:r>
-      <w:proofErr w:type="spellEnd"/>
-      <w:r>
-        <w:t>/bin/activate</w:t>
+        <w:t>[Pipeline] sh</w:t>
+      </w:r>
+    </w:p>
+    <w:p>
+      <w:r>
+        <w:t>+ python3 -m venv venv</w:t>
+      </w:r>
+    </w:p>
+    <w:p>
+      <w:r>
+        <w:t>+ . venv/bin/activate</w:t>
       </w:r>
     </w:p>
     <w:p>
@@ -5041,23 +5470,13 @@
     </w:p>
     <w:p>
       <w:r>
-        <w:t>+ [ -</w:t>
-      </w:r>
-      <w:proofErr w:type="gramStart"/>
-      <w:r>
-        <w:t>n  ]</w:t>
-      </w:r>
-      <w:proofErr w:type="gramEnd"/>
-    </w:p>
-    <w:p>
-      <w:r>
-        <w:t>+ [ -</w:t>
-      </w:r>
-      <w:proofErr w:type="gramStart"/>
-      <w:r>
-        <w:t>n  ]</w:t>
-      </w:r>
-      <w:proofErr w:type="gramEnd"/>
+        <w:t>+ [ -n  ]</w:t>
+      </w:r>
+    </w:p>
+    <w:p>
+      <w:r>
+        <w:t>+ [ -n  ]</w:t>
+      </w:r>
     </w:p>
     <w:p>
       <w:r>
@@ -5066,13 +5485,8 @@
     </w:p>
     <w:p>
       <w:r>
-        <w:t>+ [ -</w:t>
-      </w:r>
-      <w:proofErr w:type="gramStart"/>
-      <w:r>
-        <w:t>n  ]</w:t>
-      </w:r>
-      <w:proofErr w:type="gramEnd"/>
+        <w:t>+ [ -n  ]</w:t>
+      </w:r>
     </w:p>
     <w:p>
       <w:r>
@@ -5087,31 +5501,13 @@
     <w:p>
       <w:r>
         <w:lastRenderedPageBreak/>
-        <w:t xml:space="preserve">+ </w:t>
-      </w:r>
-      <w:proofErr w:type="gramStart"/>
-      <w:r>
-        <w:t>[ !</w:t>
-      </w:r>
-      <w:proofErr w:type="gramEnd"/>
-      <w:r>
-        <w:t xml:space="preserve"> nondestructive = </w:t>
-      </w:r>
-      <w:proofErr w:type="gramStart"/>
-      <w:r>
-        <w:t>nondestructive ]</w:t>
-      </w:r>
-      <w:proofErr w:type="gramEnd"/>
-    </w:p>
-    <w:p>
-      <w:r>
-        <w:t xml:space="preserve">+ </w:t>
-      </w:r>
-      <w:proofErr w:type="spellStart"/>
-      <w:r>
-        <w:t>uname</w:t>
-      </w:r>
-      <w:proofErr w:type="spellEnd"/>
+        <w:t>+ [ ! nondestructive = nondestructive ]</w:t>
+      </w:r>
+    </w:p>
+    <w:p>
+      <w:r>
+        <w:t>+ uname</w:t>
+      </w:r>
     </w:p>
     <w:p>
       <w:r>
@@ -5135,13 +5531,8 @@
     </w:p>
     <w:p>
       <w:r>
-        <w:t>+ VIRTUAL_ENV_PROMPT=</w:t>
-      </w:r>
-      <w:proofErr w:type="spellStart"/>
-      <w:r>
-        <w:t>venv</w:t>
-      </w:r>
-      <w:proofErr w:type="spellEnd"/>
+        <w:t>+ VIRTUAL_ENV_PROMPT=venv</w:t>
+      </w:r>
     </w:p>
     <w:p>
       <w:r>
@@ -5150,23 +5541,13 @@
     </w:p>
     <w:p>
       <w:r>
-        <w:t>+ [ -</w:t>
-      </w:r>
-      <w:proofErr w:type="gramStart"/>
-      <w:r>
-        <w:t>n  ]</w:t>
-      </w:r>
-      <w:proofErr w:type="gramEnd"/>
-    </w:p>
-    <w:p>
-      <w:r>
-        <w:t>+ [ -</w:t>
-      </w:r>
-      <w:proofErr w:type="gramStart"/>
-      <w:r>
-        <w:t>z  ]</w:t>
-      </w:r>
-      <w:proofErr w:type="gramEnd"/>
+        <w:t>+ [ -n  ]</w:t>
+      </w:r>
+    </w:p>
+    <w:p>
+      <w:r>
+        <w:t>+ [ -z  ]</w:t>
+      </w:r>
     </w:p>
     <w:p>
       <w:r>
@@ -5175,15 +5556,7 @@
     </w:p>
     <w:p>
       <w:r>
-        <w:t>+ PS1=(</w:t>
-      </w:r>
-      <w:proofErr w:type="spellStart"/>
-      <w:r>
-        <w:t>venv</w:t>
-      </w:r>
-      <w:proofErr w:type="spellEnd"/>
-      <w:r>
-        <w:t xml:space="preserve">) $ </w:t>
+        <w:t xml:space="preserve">+ PS1=(venv) $ </w:t>
       </w:r>
     </w:p>
     <w:p>
@@ -5203,23 +5576,7 @@
     </w:p>
     <w:p>
       <w:r>
-        <w:t xml:space="preserve">Requirement already satisfied: pip </w:t>
-      </w:r>
-      <w:proofErr w:type="gramStart"/>
-      <w:r>
-        <w:t>in .</w:t>
-      </w:r>
-      <w:proofErr w:type="gramEnd"/>
-      <w:r>
-        <w:t>/</w:t>
-      </w:r>
-      <w:proofErr w:type="spellStart"/>
-      <w:r>
-        <w:t>venv</w:t>
-      </w:r>
-      <w:proofErr w:type="spellEnd"/>
-      <w:r>
-        <w:t>/lib/python3.14/site-packages (25.1.1)</w:t>
+        <w:t>Requirement already satisfied: pip in ./venv/lib/python3.14/site-packages (25.1.1)</w:t>
       </w:r>
     </w:p>
     <w:p>
@@ -5285,15 +5642,7 @@
     </w:p>
     <w:p>
       <w:r>
-        <w:t xml:space="preserve">Collecting </w:t>
-      </w:r>
-      <w:proofErr w:type="spellStart"/>
-      <w:r>
-        <w:t>pytest</w:t>
-      </w:r>
-      <w:proofErr w:type="spellEnd"/>
-      <w:r>
-        <w:t>==8.2.2 (from -r requirements.txt (line 2))</w:t>
+        <w:t>Collecting pytest==8.2.2 (from -r requirements.txt (line 2))</w:t>
       </w:r>
     </w:p>
     <w:p>
@@ -5303,15 +5652,7 @@
     </w:p>
     <w:p>
       <w:r>
-        <w:t xml:space="preserve">Collecting </w:t>
-      </w:r>
-      <w:proofErr w:type="spellStart"/>
-      <w:r>
-        <w:t>pytest</w:t>
-      </w:r>
-      <w:proofErr w:type="spellEnd"/>
-      <w:r>
-        <w:t>-flask==1.3.0 (from -r requirements.txt (line 3))</w:t>
+        <w:t>Collecting pytest-flask==1.3.0 (from -r requirements.txt (line 3))</w:t>
       </w:r>
     </w:p>
     <w:p>
@@ -5321,15 +5662,7 @@
     </w:p>
     <w:p>
       <w:r>
-        <w:t xml:space="preserve">Collecting </w:t>
-      </w:r>
-      <w:proofErr w:type="spellStart"/>
-      <w:r>
-        <w:t>Werkzeug</w:t>
-      </w:r>
-      <w:proofErr w:type="spellEnd"/>
-      <w:r>
-        <w:t>&gt;=3.0.0 (from flask==3.0.3-&gt;-r requirements.txt (line 1))</w:t>
+        <w:t>Collecting Werkzeug&gt;=3.0.0 (from flask==3.0.3-&gt;-r requirements.txt (line 1))</w:t>
       </w:r>
     </w:p>
     <w:p>
@@ -5349,15 +5682,7 @@
     </w:p>
     <w:p>
       <w:r>
-        <w:t xml:space="preserve">Collecting </w:t>
-      </w:r>
-      <w:proofErr w:type="spellStart"/>
-      <w:r>
-        <w:t>itsdangerous</w:t>
-      </w:r>
-      <w:proofErr w:type="spellEnd"/>
-      <w:r>
-        <w:t>&gt;=2.1.2 (from flask==3.0.3-&gt;-r requirements.txt (line 1))</w:t>
+        <w:t>Collecting itsdangerous&gt;=2.1.2 (from flask==3.0.3-&gt;-r requirements.txt (line 1))</w:t>
       </w:r>
     </w:p>
     <w:p>
@@ -5387,23 +5712,7 @@
     </w:p>
     <w:p>
       <w:r>
-        <w:t xml:space="preserve">Collecting </w:t>
-      </w:r>
-      <w:proofErr w:type="spellStart"/>
-      <w:r>
-        <w:t>iniconfig</w:t>
-      </w:r>
-      <w:proofErr w:type="spellEnd"/>
-      <w:r>
-        <w:t xml:space="preserve"> (from </w:t>
-      </w:r>
-      <w:proofErr w:type="spellStart"/>
-      <w:r>
-        <w:t>pytest</w:t>
-      </w:r>
-      <w:proofErr w:type="spellEnd"/>
-      <w:r>
-        <w:t>==8.2.2-&gt;-r requirements.txt (line 2))</w:t>
+        <w:t>Collecting iniconfig (from pytest==8.2.2-&gt;-r requirements.txt (line 2))</w:t>
       </w:r>
     </w:p>
     <w:p>
@@ -5413,15 +5722,7 @@
     </w:p>
     <w:p>
       <w:r>
-        <w:t xml:space="preserve">Collecting packaging (from </w:t>
-      </w:r>
-      <w:proofErr w:type="spellStart"/>
-      <w:r>
-        <w:t>pytest</w:t>
-      </w:r>
-      <w:proofErr w:type="spellEnd"/>
-      <w:r>
-        <w:t>==8.2.2-&gt;-r requirements.txt (line 2))</w:t>
+        <w:t>Collecting packaging (from pytest==8.2.2-&gt;-r requirements.txt (line 2))</w:t>
       </w:r>
     </w:p>
     <w:p>
@@ -5431,15 +5732,7 @@
     </w:p>
     <w:p>
       <w:r>
-        <w:t xml:space="preserve">Collecting pluggy&lt;2.0,&gt;=1.5 (from </w:t>
-      </w:r>
-      <w:proofErr w:type="spellStart"/>
-      <w:r>
-        <w:t>pytest</w:t>
-      </w:r>
-      <w:proofErr w:type="spellEnd"/>
-      <w:r>
-        <w:t>==8.2.2-&gt;-r requirements.txt (line 2))</w:t>
+        <w:t>Collecting pluggy&lt;2.0,&gt;=1.5 (from pytest==8.2.2-&gt;-r requirements.txt (line 2))</w:t>
       </w:r>
     </w:p>
     <w:p>
@@ -5449,15 +5742,7 @@
     </w:p>
     <w:p>
       <w:r>
-        <w:t xml:space="preserve">Collecting </w:t>
-      </w:r>
-      <w:proofErr w:type="spellStart"/>
-      <w:r>
-        <w:t>MarkupSafe</w:t>
-      </w:r>
-      <w:proofErr w:type="spellEnd"/>
-      <w:r>
-        <w:t>&gt;=2.0 (from Jinja2&gt;=3.1.2-&gt;flask==3.0.3-&gt;-r requirements.txt (line 1))</w:t>
+        <w:t>Collecting MarkupSafe&gt;=2.0 (from Jinja2&gt;=3.1.2-&gt;flask==3.0.3-&gt;-r requirements.txt (line 1))</w:t>
       </w:r>
     </w:p>
     <w:p>
@@ -5528,55 +5813,7 @@
     </w:p>
     <w:p>
       <w:r>
-        <w:t xml:space="preserve">Installing collected packages: pluggy, packaging, </w:t>
-      </w:r>
-      <w:proofErr w:type="spellStart"/>
-      <w:r>
-        <w:t>MarkupSafe</w:t>
-      </w:r>
-      <w:proofErr w:type="spellEnd"/>
-      <w:r>
-        <w:t xml:space="preserve">, </w:t>
-      </w:r>
-      <w:proofErr w:type="spellStart"/>
-      <w:r>
-        <w:t>itsdangerous</w:t>
-      </w:r>
-      <w:proofErr w:type="spellEnd"/>
-      <w:r>
-        <w:t xml:space="preserve">, </w:t>
-      </w:r>
-      <w:proofErr w:type="spellStart"/>
-      <w:r>
-        <w:t>iniconfig</w:t>
-      </w:r>
-      <w:proofErr w:type="spellEnd"/>
-      <w:r>
-        <w:t xml:space="preserve">, click, blinker, </w:t>
-      </w:r>
-      <w:proofErr w:type="spellStart"/>
-      <w:r>
-        <w:t>Werkzeug</w:t>
-      </w:r>
-      <w:proofErr w:type="spellEnd"/>
-      <w:r>
-        <w:t xml:space="preserve">, </w:t>
-      </w:r>
-      <w:proofErr w:type="spellStart"/>
-      <w:r>
-        <w:t>pytest</w:t>
-      </w:r>
-      <w:proofErr w:type="spellEnd"/>
-      <w:r>
-        <w:t xml:space="preserve">, Jinja2, flask, </w:t>
-      </w:r>
-      <w:proofErr w:type="spellStart"/>
-      <w:r>
-        <w:t>pytest</w:t>
-      </w:r>
-      <w:proofErr w:type="spellEnd"/>
-      <w:r>
-        <w:t>-flask</w:t>
+        <w:t>Installing collected packages: pluggy, packaging, MarkupSafe, itsdangerous, iniconfig, click, blinker, Werkzeug, pytest, Jinja2, flask, pytest-flask</w:t>
       </w:r>
     </w:p>
     <w:p/>
@@ -5587,13 +5824,8 @@
     </w:p>
     <w:p>
       <w:r>
-        <w:t>[Pipeline</w:t>
-      </w:r>
-      <w:proofErr w:type="gramStart"/>
-      <w:r>
-        <w:t>] }</w:t>
-      </w:r>
-      <w:proofErr w:type="gramEnd"/>
+        <w:t>[Pipeline] }</w:t>
+      </w:r>
     </w:p>
     <w:p>
       <w:r>
@@ -5607,15 +5839,7 @@
     </w:p>
     <w:p>
       <w:r>
-        <w:t xml:space="preserve">[Pipeline] </w:t>
-      </w:r>
-      <w:proofErr w:type="gramStart"/>
-      <w:r>
-        <w:t>{ (</w:t>
-      </w:r>
-      <w:proofErr w:type="gramEnd"/>
-      <w:r>
-        <w:t>Test)</w:t>
+        <w:t>[Pipeline] { (Test)</w:t>
       </w:r>
     </w:p>
     <w:p>
@@ -5631,25 +5855,12 @@
     <w:p>
       <w:r>
         <w:lastRenderedPageBreak/>
-        <w:t xml:space="preserve">[Pipeline] </w:t>
-      </w:r>
-      <w:proofErr w:type="spellStart"/>
-      <w:r>
-        <w:t>sh</w:t>
-      </w:r>
-      <w:proofErr w:type="spellEnd"/>
-    </w:p>
-    <w:p>
-      <w:r>
-        <w:t xml:space="preserve">+ . </w:t>
-      </w:r>
-      <w:proofErr w:type="spellStart"/>
-      <w:r>
-        <w:t>venv</w:t>
-      </w:r>
-      <w:proofErr w:type="spellEnd"/>
-      <w:r>
-        <w:t>/bin/activate</w:t>
+        <w:t>[Pipeline] sh</w:t>
+      </w:r>
+    </w:p>
+    <w:p>
+      <w:r>
+        <w:t>+ . venv/bin/activate</w:t>
       </w:r>
     </w:p>
     <w:p>
@@ -5659,23 +5870,13 @@
     </w:p>
     <w:p>
       <w:r>
-        <w:t>+ [ -</w:t>
-      </w:r>
-      <w:proofErr w:type="gramStart"/>
-      <w:r>
-        <w:t>n  ]</w:t>
-      </w:r>
-      <w:proofErr w:type="gramEnd"/>
-    </w:p>
-    <w:p>
-      <w:r>
-        <w:t>+ [ -</w:t>
-      </w:r>
-      <w:proofErr w:type="gramStart"/>
-      <w:r>
-        <w:t>n  ]</w:t>
-      </w:r>
-      <w:proofErr w:type="gramEnd"/>
+        <w:t>+ [ -n  ]</w:t>
+      </w:r>
+    </w:p>
+    <w:p>
+      <w:r>
+        <w:t>+ [ -n  ]</w:t>
+      </w:r>
     </w:p>
     <w:p>
       <w:r>
@@ -5684,13 +5885,8 @@
     </w:p>
     <w:p>
       <w:r>
-        <w:t>+ [ -</w:t>
-      </w:r>
-      <w:proofErr w:type="gramStart"/>
-      <w:r>
-        <w:t>n  ]</w:t>
-      </w:r>
-      <w:proofErr w:type="gramEnd"/>
+        <w:t>+ [ -n  ]</w:t>
+      </w:r>
     </w:p>
     <w:p>
       <w:r>
@@ -5704,31 +5900,13 @@
     </w:p>
     <w:p>
       <w:r>
-        <w:t xml:space="preserve">+ </w:t>
-      </w:r>
-      <w:proofErr w:type="gramStart"/>
-      <w:r>
-        <w:t>[ !</w:t>
-      </w:r>
-      <w:proofErr w:type="gramEnd"/>
-      <w:r>
-        <w:t xml:space="preserve"> nondestructive = </w:t>
-      </w:r>
-      <w:proofErr w:type="gramStart"/>
-      <w:r>
-        <w:t>nondestructive ]</w:t>
-      </w:r>
-      <w:proofErr w:type="gramEnd"/>
-    </w:p>
-    <w:p>
-      <w:r>
-        <w:t xml:space="preserve">+ </w:t>
-      </w:r>
-      <w:proofErr w:type="spellStart"/>
-      <w:r>
-        <w:t>uname</w:t>
-      </w:r>
-      <w:proofErr w:type="spellEnd"/>
+        <w:t>+ [ ! nondestructive = nondestructive ]</w:t>
+      </w:r>
+    </w:p>
+    <w:p>
+      <w:r>
+        <w:t>+ uname</w:t>
+      </w:r>
     </w:p>
     <w:p>
       <w:r>
@@ -5752,13 +5930,8 @@
     </w:p>
     <w:p>
       <w:r>
-        <w:t>+ VIRTUAL_ENV_PROMPT=</w:t>
-      </w:r>
-      <w:proofErr w:type="spellStart"/>
-      <w:r>
-        <w:t>venv</w:t>
-      </w:r>
-      <w:proofErr w:type="spellEnd"/>
+        <w:t>+ VIRTUAL_ENV_PROMPT=venv</w:t>
+      </w:r>
     </w:p>
     <w:p>
       <w:r>
@@ -5767,23 +5940,13 @@
     </w:p>
     <w:p>
       <w:r>
-        <w:t>+ [ -</w:t>
-      </w:r>
-      <w:proofErr w:type="gramStart"/>
-      <w:r>
-        <w:t>n  ]</w:t>
-      </w:r>
-      <w:proofErr w:type="gramEnd"/>
-    </w:p>
-    <w:p>
-      <w:r>
-        <w:t>+ [ -</w:t>
-      </w:r>
-      <w:proofErr w:type="gramStart"/>
-      <w:r>
-        <w:t>z  ]</w:t>
-      </w:r>
-      <w:proofErr w:type="gramEnd"/>
+        <w:t>+ [ -n  ]</w:t>
+      </w:r>
+    </w:p>
+    <w:p>
+      <w:r>
+        <w:t>+ [ -z  ]</w:t>
+      </w:r>
     </w:p>
     <w:p>
       <w:r>
@@ -5792,15 +5955,7 @@
     </w:p>
     <w:p>
       <w:r>
-        <w:t>+ PS1=(</w:t>
-      </w:r>
-      <w:proofErr w:type="spellStart"/>
-      <w:r>
-        <w:t>venv</w:t>
-      </w:r>
-      <w:proofErr w:type="spellEnd"/>
-      <w:r>
-        <w:t xml:space="preserve">) $ </w:t>
+        <w:t xml:space="preserve">+ PS1=(venv) $ </w:t>
       </w:r>
     </w:p>
     <w:p>
@@ -5815,15 +5970,7 @@
     </w:p>
     <w:p>
       <w:r>
-        <w:t xml:space="preserve">+ </w:t>
-      </w:r>
-      <w:proofErr w:type="spellStart"/>
-      <w:r>
-        <w:t>pytest</w:t>
-      </w:r>
-      <w:proofErr w:type="spellEnd"/>
-      <w:r>
-        <w:t xml:space="preserve"> test_app.py -v --tb=short</w:t>
+        <w:t>+ pytest test_app.py -v --tb=short</w:t>
       </w:r>
     </w:p>
     <w:p>
@@ -5834,53 +5981,17 @@
     <w:p>
       <w:r>
         <w:lastRenderedPageBreak/>
-        <w:t xml:space="preserve">platform </w:t>
-      </w:r>
-      <w:proofErr w:type="spellStart"/>
-      <w:r>
-        <w:t>linux</w:t>
-      </w:r>
-      <w:proofErr w:type="spellEnd"/>
-      <w:r>
-        <w:t xml:space="preserve"> -- Python 3.14.4, pytest-8.2.2, pluggy-1.6.0 -- /var/lib/jenkins/workspace/flask-jenkins-pipeline@2/venv/bin/python3</w:t>
-      </w:r>
-    </w:p>
-    <w:p>
-      <w:proofErr w:type="spellStart"/>
-      <w:r>
-        <w:t>cachedir</w:t>
-      </w:r>
-      <w:proofErr w:type="spellEnd"/>
-      <w:proofErr w:type="gramStart"/>
-      <w:r>
-        <w:t>: .</w:t>
-      </w:r>
-      <w:proofErr w:type="spellStart"/>
-      <w:r>
-        <w:t>pytest</w:t>
-      </w:r>
-      <w:proofErr w:type="gramEnd"/>
-      <w:r>
-        <w:t>_cache</w:t>
-      </w:r>
-      <w:proofErr w:type="spellEnd"/>
-    </w:p>
-    <w:p>
-      <w:proofErr w:type="spellStart"/>
-      <w:r>
-        <w:t>rootdir</w:t>
-      </w:r>
-      <w:proofErr w:type="spellEnd"/>
-      <w:r>
-        <w:t>: /var/lib/</w:t>
-      </w:r>
-      <w:proofErr w:type="spellStart"/>
-      <w:r>
-        <w:t>jenkins</w:t>
-      </w:r>
-      <w:proofErr w:type="spellEnd"/>
-      <w:r>
-        <w:t>/workspace/flask-jenkins-pipeline@2</w:t>
+        <w:t>platform linux -- Python 3.14.4, pytest-8.2.2, pluggy-1.6.0 -- /var/lib/jenkins/workspace/flask-jenkins-pipeline@2/venv/bin/python3</w:t>
+      </w:r>
+    </w:p>
+    <w:p>
+      <w:r>
+        <w:t>cachedir: .pytest_cache</w:t>
+      </w:r>
+    </w:p>
+    <w:p>
+      <w:r>
+        <w:t>rootdir: /var/lib/jenkins/workspace/flask-jenkins-pipeline@2</w:t>
       </w:r>
     </w:p>
     <w:p>
@@ -5895,72 +6006,18 @@
     </w:p>
     <w:p/>
     <w:p>
-      <w:proofErr w:type="gramStart"/>
-      <w:r>
-        <w:t>test_app.py::</w:t>
-      </w:r>
-      <w:proofErr w:type="spellStart"/>
-      <w:proofErr w:type="gramEnd"/>
-      <w:r>
-        <w:t>test_home</w:t>
-      </w:r>
-      <w:proofErr w:type="spellEnd"/>
-      <w:r>
-        <w:t xml:space="preserve"> PASSED                                         </w:t>
-      </w:r>
-      <w:proofErr w:type="gramStart"/>
-      <w:r>
-        <w:t xml:space="preserve">   [</w:t>
-      </w:r>
-      <w:proofErr w:type="gramEnd"/>
-      <w:r>
-        <w:t xml:space="preserve"> 33%]</w:t>
-      </w:r>
-    </w:p>
-    <w:p>
-      <w:proofErr w:type="gramStart"/>
-      <w:r>
-        <w:t>test_app.py::</w:t>
-      </w:r>
-      <w:proofErr w:type="spellStart"/>
-      <w:proofErr w:type="gramEnd"/>
-      <w:r>
-        <w:t>test_health</w:t>
-      </w:r>
-      <w:proofErr w:type="spellEnd"/>
-      <w:r>
-        <w:t xml:space="preserve"> PASSED                                       </w:t>
-      </w:r>
-      <w:proofErr w:type="gramStart"/>
-      <w:r>
-        <w:t xml:space="preserve">   [</w:t>
-      </w:r>
-      <w:proofErr w:type="gramEnd"/>
-      <w:r>
-        <w:t xml:space="preserve"> 66%]</w:t>
-      </w:r>
-    </w:p>
-    <w:p>
-      <w:proofErr w:type="gramStart"/>
-      <w:r>
-        <w:t>test_app.py::</w:t>
-      </w:r>
-      <w:proofErr w:type="spellStart"/>
-      <w:proofErr w:type="gramEnd"/>
-      <w:r>
-        <w:t>test_add</w:t>
-      </w:r>
-      <w:proofErr w:type="spellEnd"/>
-      <w:r>
-        <w:t xml:space="preserve"> PASSED                                          </w:t>
-      </w:r>
-      <w:proofErr w:type="gramStart"/>
-      <w:r>
-        <w:t xml:space="preserve">   [</w:t>
-      </w:r>
-      <w:proofErr w:type="gramEnd"/>
-      <w:r>
-        <w:t>100%]</w:t>
+      <w:r>
+        <w:t>test_app.py::test_home PASSED                                            [ 33%]</w:t>
+      </w:r>
+    </w:p>
+    <w:p>
+      <w:r>
+        <w:t>test_app.py::test_health PASSED                                          [ 66%]</w:t>
+      </w:r>
+    </w:p>
+    <w:p>
+      <w:r>
+        <w:t>test_app.py::test_add PASSED                                             [100%]</w:t>
       </w:r>
     </w:p>
     <w:p/>
@@ -5986,13 +6043,8 @@
     </w:p>
     <w:p>
       <w:r>
-        <w:t>[Pipeline</w:t>
-      </w:r>
-      <w:proofErr w:type="gramStart"/>
-      <w:r>
-        <w:t>] }</w:t>
-      </w:r>
-      <w:proofErr w:type="gramEnd"/>
+        <w:t>[Pipeline] }</w:t>
+      </w:r>
     </w:p>
     <w:p>
       <w:r>
@@ -6006,15 +6058,7 @@
     </w:p>
     <w:p>
       <w:r>
-        <w:t xml:space="preserve">[Pipeline] </w:t>
-      </w:r>
-      <w:proofErr w:type="gramStart"/>
-      <w:r>
-        <w:t>{ (</w:t>
-      </w:r>
-      <w:proofErr w:type="gramEnd"/>
-      <w:r>
-        <w:t>Deploy)</w:t>
+        <w:t>[Pipeline] { (Deploy)</w:t>
       </w:r>
     </w:p>
     <w:p>
@@ -6029,25 +6073,12 @@
     </w:p>
     <w:p>
       <w:r>
-        <w:t xml:space="preserve">[Pipeline] </w:t>
-      </w:r>
-      <w:proofErr w:type="spellStart"/>
-      <w:r>
-        <w:t>sh</w:t>
-      </w:r>
-      <w:proofErr w:type="spellEnd"/>
-    </w:p>
-    <w:p>
-      <w:r>
-        <w:t xml:space="preserve">+ . </w:t>
-      </w:r>
-      <w:proofErr w:type="spellStart"/>
-      <w:r>
-        <w:t>venv</w:t>
-      </w:r>
-      <w:proofErr w:type="spellEnd"/>
-      <w:r>
-        <w:t>/bin/activate</w:t>
+        <w:t>[Pipeline] sh</w:t>
+      </w:r>
+    </w:p>
+    <w:p>
+      <w:r>
+        <w:t>+ . venv/bin/activate</w:t>
       </w:r>
     </w:p>
     <w:p>
@@ -6057,23 +6088,13 @@
     </w:p>
     <w:p>
       <w:r>
-        <w:t>+ [ -</w:t>
-      </w:r>
-      <w:proofErr w:type="gramStart"/>
-      <w:r>
-        <w:t>n  ]</w:t>
-      </w:r>
-      <w:proofErr w:type="gramEnd"/>
-    </w:p>
-    <w:p>
-      <w:r>
-        <w:t>+ [ -</w:t>
-      </w:r>
-      <w:proofErr w:type="gramStart"/>
-      <w:r>
-        <w:t>n  ]</w:t>
-      </w:r>
-      <w:proofErr w:type="gramEnd"/>
+        <w:t>+ [ -n  ]</w:t>
+      </w:r>
+    </w:p>
+    <w:p>
+      <w:r>
+        <w:t>+ [ -n  ]</w:t>
+      </w:r>
     </w:p>
     <w:p>
       <w:r>
@@ -6083,13 +6104,8 @@
     </w:p>
     <w:p>
       <w:r>
-        <w:t>+ [ -</w:t>
-      </w:r>
-      <w:proofErr w:type="gramStart"/>
-      <w:r>
-        <w:t>n  ]</w:t>
-      </w:r>
-      <w:proofErr w:type="gramEnd"/>
+        <w:t>+ [ -n  ]</w:t>
+      </w:r>
     </w:p>
     <w:p>
       <w:r>
@@ -6103,31 +6119,13 @@
     </w:p>
     <w:p>
       <w:r>
-        <w:t xml:space="preserve">+ </w:t>
-      </w:r>
-      <w:proofErr w:type="gramStart"/>
-      <w:r>
-        <w:t>[ !</w:t>
-      </w:r>
-      <w:proofErr w:type="gramEnd"/>
-      <w:r>
-        <w:t xml:space="preserve"> nondestructive = </w:t>
-      </w:r>
-      <w:proofErr w:type="gramStart"/>
-      <w:r>
-        <w:t>nondestructive ]</w:t>
-      </w:r>
-      <w:proofErr w:type="gramEnd"/>
-    </w:p>
-    <w:p>
-      <w:r>
-        <w:t xml:space="preserve">+ </w:t>
-      </w:r>
-      <w:proofErr w:type="spellStart"/>
-      <w:r>
-        <w:t>uname</w:t>
-      </w:r>
-      <w:proofErr w:type="spellEnd"/>
+        <w:t>+ [ ! nondestructive = nondestructive ]</w:t>
+      </w:r>
+    </w:p>
+    <w:p>
+      <w:r>
+        <w:t>+ uname</w:t>
+      </w:r>
     </w:p>
     <w:p>
       <w:r>
@@ -6151,13 +6149,8 @@
     </w:p>
     <w:p>
       <w:r>
-        <w:t>+ VIRTUAL_ENV_PROMPT=</w:t>
-      </w:r>
-      <w:proofErr w:type="spellStart"/>
-      <w:r>
-        <w:t>venv</w:t>
-      </w:r>
-      <w:proofErr w:type="spellEnd"/>
+        <w:t>+ VIRTUAL_ENV_PROMPT=venv</w:t>
+      </w:r>
     </w:p>
     <w:p>
       <w:r>
@@ -6166,23 +6159,13 @@
     </w:p>
     <w:p>
       <w:r>
-        <w:t>+ [ -</w:t>
-      </w:r>
-      <w:proofErr w:type="gramStart"/>
-      <w:r>
-        <w:t>n  ]</w:t>
-      </w:r>
-      <w:proofErr w:type="gramEnd"/>
-    </w:p>
-    <w:p>
-      <w:r>
-        <w:t>+ [ -</w:t>
-      </w:r>
-      <w:proofErr w:type="gramStart"/>
-      <w:r>
-        <w:t>z  ]</w:t>
-      </w:r>
-      <w:proofErr w:type="gramEnd"/>
+        <w:t>+ [ -n  ]</w:t>
+      </w:r>
+    </w:p>
+    <w:p>
+      <w:r>
+        <w:t>+ [ -z  ]</w:t>
+      </w:r>
     </w:p>
     <w:p>
       <w:r>
@@ -6191,15 +6174,7 @@
     </w:p>
     <w:p>
       <w:r>
-        <w:t>+ PS1=(</w:t>
-      </w:r>
-      <w:proofErr w:type="spellStart"/>
-      <w:r>
-        <w:t>venv</w:t>
-      </w:r>
-      <w:proofErr w:type="spellEnd"/>
-      <w:r>
-        <w:t xml:space="preserve">) $ </w:t>
+        <w:t xml:space="preserve">+ PS1=(venv) $ </w:t>
       </w:r>
     </w:p>
     <w:p>
@@ -6214,29 +6189,8 @@
     </w:p>
     <w:p>
       <w:r>
-        <w:t xml:space="preserve">+ [ -f </w:t>
-      </w:r>
-      <w:proofErr w:type="gramStart"/>
-      <w:r>
-        <w:t>/</w:t>
-      </w:r>
-      <w:proofErr w:type="spellStart"/>
-      <w:r>
-        <w:t>tmp</w:t>
-      </w:r>
-      <w:proofErr w:type="spellEnd"/>
-      <w:r>
-        <w:t>/</w:t>
-      </w:r>
-      <w:proofErr w:type="spellStart"/>
-      <w:r>
-        <w:t>flask_app.pid</w:t>
-      </w:r>
-      <w:proofErr w:type="spellEnd"/>
-      <w:r>
-        <w:t xml:space="preserve"> ]</w:t>
-      </w:r>
-      <w:proofErr w:type="gramEnd"/>
+        <w:t>+ [ -f /tmp/flask_app.pid ]</w:t>
+      </w:r>
     </w:p>
     <w:p>
       <w:r>
@@ -6245,33 +6199,12 @@
     </w:p>
     <w:p>
       <w:r>
-        <w:t>+ cat /</w:t>
-      </w:r>
-      <w:proofErr w:type="spellStart"/>
-      <w:r>
-        <w:t>tmp</w:t>
-      </w:r>
-      <w:proofErr w:type="spellEnd"/>
-      <w:r>
-        <w:t>/</w:t>
-      </w:r>
-      <w:proofErr w:type="spellStart"/>
-      <w:r>
-        <w:t>flask_app.pid</w:t>
-      </w:r>
-      <w:proofErr w:type="spellEnd"/>
-    </w:p>
-    <w:p>
-      <w:r>
-        <w:t xml:space="preserve">+ </w:t>
-      </w:r>
-      <w:proofErr w:type="spellStart"/>
-      <w:r>
-        <w:t>nohup</w:t>
-      </w:r>
-      <w:proofErr w:type="spellEnd"/>
-      <w:r>
-        <w:t xml:space="preserve"> python3 app.py</w:t>
+        <w:t>+ cat /tmp/flask_app.pid</w:t>
+      </w:r>
+    </w:p>
+    <w:p>
+      <w:r>
+        <w:t>+ nohup python3 app.py</w:t>
       </w:r>
     </w:p>
     <w:p>
@@ -6294,7 +6227,7 @@
         <w:lastRenderedPageBreak/>
         <w:t xml:space="preserve">+ curl -f </w:t>
       </w:r>
-      <w:hyperlink r:id="rId59" w:history="1">
+      <w:hyperlink r:id="rId60" w:history="1">
         <w:r>
           <w:rPr>
             <w:rStyle w:val="Hyperlink"/>
@@ -6305,62 +6238,12 @@
     </w:p>
     <w:p>
       <w:r>
-        <w:t xml:space="preserve">  % Total    % Received % </w:t>
-      </w:r>
-      <w:proofErr w:type="spellStart"/>
-      <w:proofErr w:type="gramStart"/>
-      <w:r>
-        <w:t>Xferd</w:t>
-      </w:r>
-      <w:proofErr w:type="spellEnd"/>
-      <w:r>
-        <w:t xml:space="preserve">  Average</w:t>
-      </w:r>
-      <w:proofErr w:type="gramEnd"/>
-      <w:r>
-        <w:t xml:space="preserve"> </w:t>
-      </w:r>
-      <w:proofErr w:type="gramStart"/>
-      <w:r>
-        <w:t>Speed  Time</w:t>
-      </w:r>
-      <w:proofErr w:type="gramEnd"/>
-      <w:r>
-        <w:t xml:space="preserve">    </w:t>
-      </w:r>
-      <w:proofErr w:type="spellStart"/>
-      <w:r>
-        <w:t>Time</w:t>
-      </w:r>
-      <w:proofErr w:type="spellEnd"/>
-      <w:r>
-        <w:t xml:space="preserve">    </w:t>
-      </w:r>
-      <w:proofErr w:type="spellStart"/>
-      <w:r>
-        <w:t>Time</w:t>
-      </w:r>
-      <w:proofErr w:type="spellEnd"/>
-      <w:r>
-        <w:t xml:space="preserve">   Current</w:t>
-      </w:r>
-    </w:p>
-    <w:p>
-      <w:r>
-        <w:t xml:space="preserve">                                 </w:t>
-      </w:r>
-      <w:proofErr w:type="spellStart"/>
-      <w:proofErr w:type="gramStart"/>
-      <w:r>
-        <w:t>Dload</w:t>
-      </w:r>
-      <w:proofErr w:type="spellEnd"/>
-      <w:r>
-        <w:t xml:space="preserve">  Upload</w:t>
-      </w:r>
-      <w:proofErr w:type="gramEnd"/>
-      <w:r>
-        <w:t xml:space="preserve">  Total   Spent   Left   Speed</w:t>
+        <w:t xml:space="preserve">  % Total    % Received % Xferd  Average Speed  Time    Time    Time   Current</w:t>
+      </w:r>
+    </w:p>
+    <w:p>
+      <w:r>
+        <w:t xml:space="preserve">                                 Dload  Upload  Total   Spent   Left   Speed</w:t>
       </w:r>
     </w:p>
     <w:p/>
@@ -6386,15 +6269,7 @@
     </w:p>
     <w:p>
       <w:r>
-        <w:t>{"</w:t>
-      </w:r>
-      <w:proofErr w:type="spellStart"/>
-      <w:r>
-        <w:t>status":"healthy</w:t>
-      </w:r>
-      <w:proofErr w:type="spellEnd"/>
-      <w:r>
-        <w:t>"}</w:t>
+        <w:t>{"status":"healthy"}</w:t>
       </w:r>
     </w:p>
     <w:p>
@@ -6409,13 +6284,8 @@
     </w:p>
     <w:p>
       <w:r>
-        <w:t>[Pipeline</w:t>
-      </w:r>
-      <w:proofErr w:type="gramStart"/>
-      <w:r>
-        <w:t>] }</w:t>
-      </w:r>
-      <w:proofErr w:type="gramEnd"/>
+        <w:t>[Pipeline] }</w:t>
+      </w:r>
     </w:p>
     <w:p>
       <w:r>
@@ -6429,26 +6299,13 @@
     </w:p>
     <w:p>
       <w:r>
-        <w:t xml:space="preserve">[Pipeline] </w:t>
-      </w:r>
-      <w:proofErr w:type="gramStart"/>
-      <w:r>
-        <w:t>{ (</w:t>
-      </w:r>
-      <w:proofErr w:type="gramEnd"/>
-      <w:r>
-        <w:t>Declarative: Post Actions)</w:t>
-      </w:r>
-    </w:p>
-    <w:p>
-      <w:r>
-        <w:t xml:space="preserve">[Pipeline] </w:t>
-      </w:r>
-      <w:proofErr w:type="spellStart"/>
-      <w:r>
-        <w:t>cleanWs</w:t>
-      </w:r>
-      <w:proofErr w:type="spellEnd"/>
+        <w:t>[Pipeline] { (Declarative: Post Actions)</w:t>
+      </w:r>
+    </w:p>
+    <w:p>
+      <w:r>
+        <w:t>[Pipeline] cleanWs</w:t>
+      </w:r>
     </w:p>
     <w:p>
       <w:r>
@@ -6482,13 +6339,8 @@
     </w:p>
     <w:p>
       <w:r>
-        <w:t>[Pipeline</w:t>
-      </w:r>
-      <w:proofErr w:type="gramStart"/>
-      <w:r>
-        <w:t>] }</w:t>
-      </w:r>
-      <w:proofErr w:type="gramEnd"/>
+        <w:t>[Pipeline] }</w:t>
+      </w:r>
     </w:p>
     <w:p>
       <w:r>
@@ -6497,54 +6349,29 @@
     </w:p>
     <w:p>
       <w:r>
-        <w:t>[Pipeline</w:t>
-      </w:r>
-      <w:proofErr w:type="gramStart"/>
-      <w:r>
-        <w:t>] }</w:t>
-      </w:r>
-      <w:proofErr w:type="gramEnd"/>
-    </w:p>
-    <w:p>
-      <w:r>
-        <w:t xml:space="preserve">[Pipeline] // </w:t>
-      </w:r>
-      <w:proofErr w:type="spellStart"/>
-      <w:r>
-        <w:t>withEnv</w:t>
-      </w:r>
-      <w:proofErr w:type="spellEnd"/>
+        <w:t>[Pipeline] }</w:t>
+      </w:r>
+    </w:p>
+    <w:p>
+      <w:r>
+        <w:t>[Pipeline] // withEnv</w:t>
+      </w:r>
     </w:p>
     <w:p>
       <w:r>
         <w:lastRenderedPageBreak/>
-        <w:t>[Pipeline</w:t>
-      </w:r>
-      <w:proofErr w:type="gramStart"/>
-      <w:r>
-        <w:t>] }</w:t>
-      </w:r>
-      <w:proofErr w:type="gramEnd"/>
-    </w:p>
-    <w:p>
-      <w:r>
-        <w:t xml:space="preserve">[Pipeline] // </w:t>
-      </w:r>
-      <w:proofErr w:type="spellStart"/>
-      <w:r>
-        <w:t>withEnv</w:t>
-      </w:r>
-      <w:proofErr w:type="spellEnd"/>
-    </w:p>
-    <w:p>
-      <w:r>
-        <w:t>[Pipeline</w:t>
-      </w:r>
-      <w:proofErr w:type="gramStart"/>
-      <w:r>
-        <w:t>] }</w:t>
-      </w:r>
-      <w:proofErr w:type="gramEnd"/>
+        <w:t>[Pipeline] }</w:t>
+      </w:r>
+    </w:p>
+    <w:p>
+      <w:r>
+        <w:t>[Pipeline] // withEnv</w:t>
+      </w:r>
+    </w:p>
+    <w:p>
+      <w:r>
+        <w:t>[Pipeline] }</w:t>
+      </w:r>
     </w:p>
     <w:p>
       <w:r>
@@ -6565,17 +6392,24 @@
       <w:pPr>
         <w:pStyle w:val="Heading2"/>
       </w:pPr>
+      <w:bookmarkStart w:id="14" w:name="_Toc233919951"/>
       <w:r>
         <w:t>4. Triggers:</w:t>
       </w:r>
+      <w:bookmarkEnd w:id="14"/>
     </w:p>
     <w:p>
       <w:pPr>
         <w:pStyle w:val="Heading3"/>
       </w:pPr>
       <w:r>
-        <w:t>   - Configure the pipeline to trigger a new build whenever changes are pushed to the main branch of the repository.</w:t>
-      </w:r>
+        <w:t>   </w:t>
+      </w:r>
+      <w:bookmarkStart w:id="15" w:name="_Toc233919952"/>
+      <w:r>
+        <w:t>- Configure the pipeline to trigger a new build whenever changes are pushed to the main branch of the repository.</w:t>
+      </w:r>
+      <w:bookmarkEnd w:id="15"/>
     </w:p>
     <w:p>
       <w:pPr>
@@ -6602,17 +6436,24 @@
       <w:pPr>
         <w:pStyle w:val="Heading2"/>
       </w:pPr>
+      <w:bookmarkStart w:id="16" w:name="_Toc233919953"/>
       <w:r>
         <w:t>5. Notifications:</w:t>
       </w:r>
+      <w:bookmarkEnd w:id="16"/>
     </w:p>
     <w:p>
       <w:pPr>
         <w:pStyle w:val="Heading3"/>
       </w:pPr>
       <w:r>
-        <w:t>   - Set up a notification system to alert via email when the build process fails or succeeds.</w:t>
-      </w:r>
+        <w:t>   </w:t>
+      </w:r>
+      <w:bookmarkStart w:id="17" w:name="_Toc233919954"/>
+      <w:r>
+        <w:t>- Set up a notification system to alert via email when the build process fails or succeeds.</w:t>
+      </w:r>
+      <w:bookmarkEnd w:id="17"/>
     </w:p>
     <w:p/>
     <w:p>
@@ -6656,7 +6497,7 @@
                     <pic:cNvPicPr/>
                   </pic:nvPicPr>
                   <pic:blipFill>
-                    <a:blip r:embed="rId60"/>
+                    <a:blip r:embed="rId61"/>
                     <a:stretch>
                       <a:fillRect/>
                     </a:stretch>
@@ -6683,13 +6524,7 @@
       </w:pPr>
       <w:r>
         <w:lastRenderedPageBreak/>
-        <w:t xml:space="preserve">When the build is triggered, the results is sent to email on Build </w:t>
-      </w:r>
-      <w:r>
-        <w:t>failure</w:t>
-      </w:r>
-      <w:r>
-        <w:t>:</w:t>
+        <w:t>When the build is triggered, the results is sent to email on Build failure:</w:t>
       </w:r>
     </w:p>
     <w:p>
@@ -6713,7 +6548,7 @@
                     <pic:cNvPicPr/>
                   </pic:nvPicPr>
                   <pic:blipFill>
-                    <a:blip r:embed="rId61"/>
+                    <a:blip r:embed="rId62"/>
                     <a:stretch>
                       <a:fillRect/>
                     </a:stretch>
@@ -6739,17 +6574,24 @@
       <w:pPr>
         <w:pStyle w:val="Heading2"/>
       </w:pPr>
+      <w:bookmarkStart w:id="18" w:name="_Toc233919955"/>
       <w:r>
         <w:t>6. Documentation:</w:t>
       </w:r>
+      <w:bookmarkEnd w:id="18"/>
     </w:p>
     <w:p>
       <w:pPr>
         <w:pStyle w:val="Heading3"/>
       </w:pPr>
       <w:r>
-        <w:t>   - Document the pipeline process and any prerequisites needed for the setup in a README.md file in the repository.</w:t>
-      </w:r>
+        <w:t>   </w:t>
+      </w:r>
+      <w:bookmarkStart w:id="19" w:name="_Toc233919956"/>
+      <w:r>
+        <w:t>- Document the pipeline process and any prerequisites needed for the setup in a README.md file in the repository.</w:t>
+      </w:r>
+      <w:bookmarkEnd w:id="19"/>
     </w:p>
     <w:p/>
     <w:p>
@@ -6785,7 +6627,7 @@
                     <pic:cNvPicPr/>
                   </pic:nvPicPr>
                   <pic:blipFill>
-                    <a:blip r:embed="rId62"/>
+                    <a:blip r:embed="rId63"/>
                     <a:stretch>
                       <a:fillRect/>
                     </a:stretch>
@@ -6810,21 +6652,21 @@
       <w:pPr>
         <w:pStyle w:val="Heading1"/>
       </w:pPr>
-      <w:bookmarkStart w:id="13" w:name="_Toc233917678"/>
+      <w:bookmarkStart w:id="20" w:name="_Toc233919957"/>
       <w:r>
         <w:t>GitHub Actions CI/CD Pipeline Flask App</w:t>
       </w:r>
-      <w:bookmarkEnd w:id="13"/>
+      <w:bookmarkEnd w:id="20"/>
     </w:p>
     <w:p>
       <w:pPr>
         <w:pStyle w:val="Heading2"/>
       </w:pPr>
-      <w:bookmarkStart w:id="14" w:name="_Toc233917679"/>
+      <w:bookmarkStart w:id="21" w:name="_Toc233919958"/>
       <w:r>
         <w:t>1. Setup:</w:t>
       </w:r>
-      <w:bookmarkEnd w:id="14"/>
+      <w:bookmarkEnd w:id="21"/>
     </w:p>
     <w:p>
       <w:pPr>
@@ -6833,11 +6675,11 @@
       <w:r>
         <w:t>   </w:t>
       </w:r>
-      <w:bookmarkStart w:id="15" w:name="_Toc233917680"/>
+      <w:bookmarkStart w:id="22" w:name="_Toc233919959"/>
       <w:r>
         <w:t>- Use a provided Python application repository on GitHub (provide a link to a sample Python application repository).</w:t>
       </w:r>
-      <w:bookmarkEnd w:id="15"/>
+      <w:bookmarkEnd w:id="22"/>
     </w:p>
     <w:p>
       <w:pPr>
@@ -6846,11 +6688,11 @@
       <w:r>
         <w:t>   </w:t>
       </w:r>
-      <w:bookmarkStart w:id="16" w:name="_Toc233917681"/>
+      <w:bookmarkStart w:id="23" w:name="_Toc233919960"/>
       <w:r>
         <w:t>- Ensure the repository has a main branch and a staging branch.</w:t>
       </w:r>
-      <w:bookmarkEnd w:id="16"/>
+      <w:bookmarkEnd w:id="23"/>
     </w:p>
     <w:p/>
     <w:p>
@@ -6891,7 +6733,7 @@
                     <pic:cNvPicPr/>
                   </pic:nvPicPr>
                   <pic:blipFill>
-                    <a:blip r:embed="rId63"/>
+                    <a:blip r:embed="rId64"/>
                     <a:stretch>
                       <a:fillRect/>
                     </a:stretch>
@@ -6933,7 +6775,7 @@
                     <pic:cNvPicPr/>
                   </pic:nvPicPr>
                   <pic:blipFill>
-                    <a:blip r:embed="rId64"/>
+                    <a:blip r:embed="rId65"/>
                     <a:stretch>
                       <a:fillRect/>
                     </a:stretch>
@@ -6975,7 +6817,7 @@
                     <pic:cNvPicPr/>
                   </pic:nvPicPr>
                   <pic:blipFill>
-                    <a:blip r:embed="rId65"/>
+                    <a:blip r:embed="rId66"/>
                     <a:stretch>
                       <a:fillRect/>
                     </a:stretch>
@@ -7001,11 +6843,11 @@
       <w:pPr>
         <w:pStyle w:val="Heading2"/>
       </w:pPr>
-      <w:bookmarkStart w:id="17" w:name="_Toc233917682"/>
+      <w:bookmarkStart w:id="24" w:name="_Toc233919961"/>
       <w:r>
         <w:t>2. GitHub Actions Workflow:</w:t>
       </w:r>
-      <w:bookmarkEnd w:id="17"/>
+      <w:bookmarkEnd w:id="24"/>
     </w:p>
     <w:p>
       <w:pPr>
@@ -7014,24 +6856,11 @@
       <w:r>
         <w:t>   </w:t>
       </w:r>
-      <w:bookmarkStart w:id="18" w:name="_Toc233917683"/>
-      <w:r>
-        <w:t xml:space="preserve">- Create </w:t>
-      </w:r>
-      <w:proofErr w:type="gramStart"/>
-      <w:r>
-        <w:t>a .</w:t>
-      </w:r>
-      <w:proofErr w:type="spellStart"/>
-      <w:r>
-        <w:t>github</w:t>
-      </w:r>
-      <w:proofErr w:type="spellEnd"/>
-      <w:proofErr w:type="gramEnd"/>
-      <w:r>
-        <w:t>/workflows directory in your repository.</w:t>
-      </w:r>
-      <w:bookmarkEnd w:id="18"/>
+      <w:bookmarkStart w:id="25" w:name="_Toc233919962"/>
+      <w:r>
+        <w:t>- Create a .github/workflows directory in your repository.</w:t>
+      </w:r>
+      <w:bookmarkEnd w:id="25"/>
     </w:p>
     <w:p>
       <w:pPr>
@@ -7040,11 +6869,11 @@
       <w:r>
         <w:t>   </w:t>
       </w:r>
-      <w:bookmarkStart w:id="19" w:name="_Toc233917684"/>
+      <w:bookmarkStart w:id="26" w:name="_Toc233919963"/>
       <w:r>
         <w:t>- Inside the directory, create a YAML file to define the workflow.</w:t>
       </w:r>
-      <w:bookmarkEnd w:id="19"/>
+      <w:bookmarkEnd w:id="26"/>
     </w:p>
     <w:p/>
     <w:p>
@@ -7083,7 +6912,7 @@
                     <pic:cNvPicPr/>
                   </pic:nvPicPr>
                   <pic:blipFill>
-                    <a:blip r:embed="rId66"/>
+                    <a:blip r:embed="rId67"/>
                     <a:stretch>
                       <a:fillRect/>
                     </a:stretch>
@@ -7141,7 +6970,7 @@
                     <pic:cNvPicPr/>
                   </pic:nvPicPr>
                   <pic:blipFill>
-                    <a:blip r:embed="rId67"/>
+                    <a:blip r:embed="rId68"/>
                     <a:stretch>
                       <a:fillRect/>
                     </a:stretch>
@@ -7183,7 +7012,7 @@
                     <pic:cNvPicPr/>
                   </pic:nvPicPr>
                   <pic:blipFill>
-                    <a:blip r:embed="rId68"/>
+                    <a:blip r:embed="rId69"/>
                     <a:stretch>
                       <a:fillRect/>
                     </a:stretch>
@@ -7226,7 +7055,7 @@
                     <pic:cNvPicPr/>
                   </pic:nvPicPr>
                   <pic:blipFill>
-                    <a:blip r:embed="rId69"/>
+                    <a:blip r:embed="rId70"/>
                     <a:stretch>
                       <a:fillRect/>
                     </a:stretch>
@@ -7268,7 +7097,7 @@
                     <pic:cNvPicPr/>
                   </pic:nvPicPr>
                   <pic:blipFill>
-                    <a:blip r:embed="rId70"/>
+                    <a:blip r:embed="rId71"/>
                     <a:stretch>
                       <a:fillRect/>
                     </a:stretch>
@@ -7294,12 +7123,12 @@
       <w:pPr>
         <w:pStyle w:val="Heading2"/>
       </w:pPr>
-      <w:bookmarkStart w:id="20" w:name="_Toc233917685"/>
+      <w:bookmarkStart w:id="27" w:name="_Toc233919964"/>
       <w:r>
         <w:lastRenderedPageBreak/>
         <w:t>4. Environment Secrets:</w:t>
       </w:r>
-      <w:bookmarkEnd w:id="20"/>
+      <w:bookmarkEnd w:id="27"/>
     </w:p>
     <w:p>
       <w:pPr>
@@ -7308,11 +7137,11 @@
       <w:r>
         <w:t>   </w:t>
       </w:r>
-      <w:bookmarkStart w:id="21" w:name="_Toc233917686"/>
+      <w:bookmarkStart w:id="28" w:name="_Toc233919965"/>
       <w:r>
         <w:t>- Use GitHub Secrets to store sensitive information required for deployments (e.g., deployment keys, API tokens).</w:t>
       </w:r>
-      <w:bookmarkEnd w:id="21"/>
+      <w:bookmarkEnd w:id="28"/>
     </w:p>
     <w:p>
       <w:pPr>
@@ -7330,15 +7159,7 @@
         <w:t>SSH_PRIVATE_KEY</w:t>
       </w:r>
       <w:r>
-        <w:t>&gt;&gt; full contents of the .</w:t>
-      </w:r>
-      <w:proofErr w:type="spellStart"/>
-      <w:r>
-        <w:t>pem</w:t>
-      </w:r>
-      <w:proofErr w:type="spellEnd"/>
-      <w:r>
-        <w:t xml:space="preserve"> file</w:t>
+        <w:t>&gt;&gt; full contents of the .pem file</w:t>
       </w:r>
     </w:p>
     <w:p>
@@ -7412,7 +7233,7 @@
                     <pic:cNvPicPr/>
                   </pic:nvPicPr>
                   <pic:blipFill>
-                    <a:blip r:embed="rId71"/>
+                    <a:blip r:embed="rId72"/>
                     <a:stretch>
                       <a:fillRect/>
                     </a:stretch>
@@ -7463,7 +7284,7 @@
                     <pic:cNvPicPr/>
                   </pic:nvPicPr>
                   <pic:blipFill>
-                    <a:blip r:embed="rId72"/>
+                    <a:blip r:embed="rId73"/>
                     <a:stretch>
                       <a:fillRect/>
                     </a:stretch>
@@ -7506,7 +7327,7 @@
                     <pic:cNvPicPr/>
                   </pic:nvPicPr>
                   <pic:blipFill>
-                    <a:blip r:embed="rId73"/>
+                    <a:blip r:embed="rId74"/>
                     <a:stretch>
                       <a:fillRect/>
                     </a:stretch>
@@ -7548,7 +7369,7 @@
                     <pic:cNvPicPr/>
                   </pic:nvPicPr>
                   <pic:blipFill>
-                    <a:blip r:embed="rId74"/>
+                    <a:blip r:embed="rId75"/>
                     <a:stretch>
                       <a:fillRect/>
                     </a:stretch>
@@ -7573,11 +7394,11 @@
       <w:pPr>
         <w:pStyle w:val="Heading2"/>
       </w:pPr>
-      <w:bookmarkStart w:id="22" w:name="_Toc233917687"/>
+      <w:bookmarkStart w:id="29" w:name="_Toc233919966"/>
       <w:r>
         <w:t>3. Workflow Steps:</w:t>
       </w:r>
-      <w:bookmarkEnd w:id="22"/>
+      <w:bookmarkEnd w:id="29"/>
     </w:p>
     <w:p>
       <w:pPr>
@@ -7586,11 +7407,11 @@
       <w:r>
         <w:t>     </w:t>
       </w:r>
-      <w:bookmarkStart w:id="23" w:name="_Toc233917688"/>
+      <w:bookmarkStart w:id="30" w:name="_Toc233919967"/>
       <w:r>
         <w:t>- Define a workflow that performs the following jobs:</w:t>
       </w:r>
-      <w:bookmarkEnd w:id="23"/>
+      <w:bookmarkEnd w:id="30"/>
     </w:p>
     <w:p>
       <w:pPr>
@@ -7599,11 +7420,11 @@
       <w:r>
         <w:t>     </w:t>
       </w:r>
-      <w:bookmarkStart w:id="24" w:name="_Toc233917689"/>
+      <w:bookmarkStart w:id="31" w:name="_Toc233919968"/>
       <w:r>
         <w:t>- Install Dependencies: Install all necessary dependencies for the Python application using pip.</w:t>
       </w:r>
-      <w:bookmarkEnd w:id="24"/>
+      <w:bookmarkEnd w:id="31"/>
     </w:p>
     <w:p>
       <w:pPr>
@@ -7612,19 +7433,11 @@
       <w:r>
         <w:t>     </w:t>
       </w:r>
-      <w:bookmarkStart w:id="25" w:name="_Toc233917690"/>
-      <w:r>
-        <w:t xml:space="preserve">- Run Tests: Execute the test suite using a framework like </w:t>
-      </w:r>
-      <w:proofErr w:type="spellStart"/>
-      <w:r>
-        <w:t>pytest</w:t>
-      </w:r>
-      <w:proofErr w:type="spellEnd"/>
-      <w:r>
-        <w:t>.</w:t>
-      </w:r>
-      <w:bookmarkEnd w:id="25"/>
+      <w:bookmarkStart w:id="32" w:name="_Toc233919969"/>
+      <w:r>
+        <w:t>- Run Tests: Execute the test suite using a framework like pytest.</w:t>
+      </w:r>
+      <w:bookmarkEnd w:id="32"/>
     </w:p>
     <w:p>
       <w:pPr>
@@ -7633,11 +7446,11 @@
       <w:r>
         <w:t>     </w:t>
       </w:r>
-      <w:bookmarkStart w:id="26" w:name="_Toc233917691"/>
+      <w:bookmarkStart w:id="33" w:name="_Toc233919970"/>
       <w:r>
         <w:t>- Build: If tests pass, prepare the application for deployment.</w:t>
       </w:r>
-      <w:bookmarkEnd w:id="26"/>
+      <w:bookmarkEnd w:id="33"/>
     </w:p>
     <w:p>
       <w:pPr>
@@ -7646,7 +7459,7 @@
       <w:r>
         <w:t>     </w:t>
       </w:r>
-      <w:bookmarkStart w:id="27" w:name="_Toc233917692"/>
+      <w:bookmarkStart w:id="34" w:name="_Toc233919971"/>
       <w:r>
         <w:t>- Deploy to Staging: Deploy the application to a staging environment when changes are pushed to the staging</w:t>
       </w:r>
@@ -7656,7 +7469,7 @@
       <w:r>
         <w:t>branch.</w:t>
       </w:r>
-      <w:bookmarkEnd w:id="27"/>
+      <w:bookmarkEnd w:id="34"/>
     </w:p>
     <w:p>
       <w:pPr>
@@ -7665,11 +7478,11 @@
       <w:r>
         <w:t>     </w:t>
       </w:r>
-      <w:bookmarkStart w:id="28" w:name="_Toc233917693"/>
+      <w:bookmarkStart w:id="35" w:name="_Toc233919972"/>
       <w:r>
         <w:t>- Deploy to Production: Deploy the application to production when a release is tagged.</w:t>
       </w:r>
-      <w:bookmarkEnd w:id="28"/>
+      <w:bookmarkEnd w:id="35"/>
     </w:p>
     <w:p/>
     <w:p>
@@ -7702,7 +7515,7 @@
                     <pic:cNvPicPr/>
                   </pic:nvPicPr>
                   <pic:blipFill>
-                    <a:blip r:embed="rId75"/>
+                    <a:blip r:embed="rId76"/>
                     <a:stretch>
                       <a:fillRect/>
                     </a:stretch>
@@ -7744,7 +7557,7 @@
                     <pic:cNvPicPr/>
                   </pic:nvPicPr>
                   <pic:blipFill>
-                    <a:blip r:embed="rId76"/>
+                    <a:blip r:embed="rId77"/>
                     <a:stretch>
                       <a:fillRect/>
                     </a:stretch>
@@ -7807,7 +7620,7 @@
                     <pic:cNvPicPr/>
                   </pic:nvPicPr>
                   <pic:blipFill>
-                    <a:blip r:embed="rId77"/>
+                    <a:blip r:embed="rId78"/>
                     <a:stretch>
                       <a:fillRect/>
                     </a:stretch>
@@ -7875,7 +7688,7 @@
                     <pic:cNvPicPr/>
                   </pic:nvPicPr>
                   <pic:blipFill>
-                    <a:blip r:embed="rId78"/>
+                    <a:blip r:embed="rId79"/>
                     <a:stretch>
                       <a:fillRect/>
                     </a:stretch>
@@ -7939,7 +7752,7 @@
                     <pic:cNvPicPr/>
                   </pic:nvPicPr>
                   <pic:blipFill>
-                    <a:blip r:embed="rId79"/>
+                    <a:blip r:embed="rId80"/>
                     <a:stretch>
                       <a:fillRect/>
                     </a:stretch>
@@ -7981,7 +7794,7 @@
                     <pic:cNvPicPr/>
                   </pic:nvPicPr>
                   <pic:blipFill>
-                    <a:blip r:embed="rId80"/>
+                    <a:blip r:embed="rId81"/>
                     <a:stretch>
                       <a:fillRect/>
                     </a:stretch>
@@ -8024,7 +7837,7 @@
                     <pic:cNvPicPr/>
                   </pic:nvPicPr>
                   <pic:blipFill>
-                    <a:blip r:embed="rId81"/>
+                    <a:blip r:embed="rId82"/>
                     <a:stretch>
                       <a:fillRect/>
                     </a:stretch>
@@ -8075,7 +7888,7 @@
                     <pic:cNvPicPr/>
                   </pic:nvPicPr>
                   <pic:blipFill>
-                    <a:blip r:embed="rId82"/>
+                    <a:blip r:embed="rId83"/>
                     <a:stretch>
                       <a:fillRect/>
                     </a:stretch>
@@ -8125,7 +7938,7 @@
                     <pic:cNvPicPr/>
                   </pic:nvPicPr>
                   <pic:blipFill>
-                    <a:blip r:embed="rId83"/>
+                    <a:blip r:embed="rId84"/>
                     <a:stretch>
                       <a:fillRect/>
                     </a:stretch>
@@ -8167,7 +7980,7 @@
                     <pic:cNvPicPr/>
                   </pic:nvPicPr>
                   <pic:blipFill>
-                    <a:blip r:embed="rId84"/>
+                    <a:blip r:embed="rId85"/>
                     <a:stretch>
                       <a:fillRect/>
                     </a:stretch>
@@ -8219,7 +8032,7 @@
                     <pic:cNvPicPr/>
                   </pic:nvPicPr>
                   <pic:blipFill>
-                    <a:blip r:embed="rId85"/>
+                    <a:blip r:embed="rId86"/>
                     <a:stretch>
                       <a:fillRect/>
                     </a:stretch>
@@ -8261,7 +8074,7 @@
                     <pic:cNvPicPr/>
                   </pic:nvPicPr>
                   <pic:blipFill>
-                    <a:blip r:embed="rId86"/>
+                    <a:blip r:embed="rId87"/>
                     <a:stretch>
                       <a:fillRect/>
                     </a:stretch>
@@ -8304,7 +8117,7 @@
                     <pic:cNvPicPr/>
                   </pic:nvPicPr>
                   <pic:blipFill>
-                    <a:blip r:embed="rId87"/>
+                    <a:blip r:embed="rId88"/>
                     <a:stretch>
                       <a:fillRect/>
                     </a:stretch>
@@ -8346,7 +8159,7 @@
                     <pic:cNvPicPr/>
                   </pic:nvPicPr>
                   <pic:blipFill>
-                    <a:blip r:embed="rId88"/>
+                    <a:blip r:embed="rId89"/>
                     <a:stretch>
                       <a:fillRect/>
                     </a:stretch>
@@ -8390,7 +8203,7 @@
                     <pic:cNvPicPr/>
                   </pic:nvPicPr>
                   <pic:blipFill>
-                    <a:blip r:embed="rId89"/>
+                    <a:blip r:embed="rId90"/>
                     <a:stretch>
                       <a:fillRect/>
                     </a:stretch>
@@ -8416,17 +8229,24 @@
       <w:pPr>
         <w:pStyle w:val="Heading2"/>
       </w:pPr>
+      <w:bookmarkStart w:id="36" w:name="_Toc233919973"/>
       <w:r>
         <w:t>5. Documentation:</w:t>
       </w:r>
+      <w:bookmarkEnd w:id="36"/>
     </w:p>
     <w:p>
       <w:pPr>
         <w:pStyle w:val="Heading3"/>
       </w:pPr>
       <w:r>
-        <w:t>   - Update the README.md file with instructions on how the GitHub Actions workflow works and how to configure the necessary secrets.</w:t>
-      </w:r>
+        <w:t>   </w:t>
+      </w:r>
+      <w:bookmarkStart w:id="37" w:name="_Toc233919974"/>
+      <w:r>
+        <w:t>- Update the README.md file with instructions on how the GitHub Actions workflow works and how to configure the necessary secrets.</w:t>
+      </w:r>
+      <w:bookmarkEnd w:id="37"/>
     </w:p>
     <w:p/>
     <w:p>
@@ -8459,7 +8279,7 @@
                     <pic:cNvPicPr/>
                   </pic:nvPicPr>
                   <pic:blipFill>
-                    <a:blip r:embed="rId90"/>
+                    <a:blip r:embed="rId91"/>
                     <a:stretch>
                       <a:fillRect/>
                     </a:stretch>

</xml_diff>